<commit_message>
Complete contract pack and OOTB strategy; align hypercare, size tiers, hosting escalation and liability cap wording
</commit_message>
<xml_diff>
--- a/docs/package/out/BrokerVerse_Commercial_Proposal_Note.docx
+++ b/docs/package/out/BrokerVerse_Commercial_Proposal_Note.docx
@@ -10,7 +10,7 @@
       <w:r>
         <w:rPr/>
         <w:drawing>
-          <wp:anchor behindDoc="1" distT="0" distB="0" distL="0" distR="0" simplePos="0" locked="0" layoutInCell="0" allowOverlap="1" relativeHeight="24">
+          <wp:anchor behindDoc="1" distT="0" distB="0" distL="0" distR="0" simplePos="0" locked="0" layoutInCell="0" allowOverlap="1" relativeHeight="23">
             <wp:simplePos x="0" y="0"/>
             <wp:positionH relativeFrom="margin">
               <wp:posOffset>-914400</wp:posOffset>
@@ -55,7 +55,7 @@
           </wp:anchor>
         </w:drawing>
         <w:drawing>
-          <wp:anchor behindDoc="1" distT="0" distB="0" distL="0" distR="0" simplePos="0" locked="0" layoutInCell="0" allowOverlap="1" relativeHeight="35">
+          <wp:anchor behindDoc="1" distT="0" distB="0" distL="0" distR="0" simplePos="0" locked="0" layoutInCell="0" allowOverlap="1" relativeHeight="34">
             <wp:simplePos x="0" y="0"/>
             <wp:positionH relativeFrom="margin">
               <wp:align>center</wp:align>
@@ -111,7 +111,7 @@
         <mc:AlternateContent>
           <mc:Choice Requires="wps">
             <w:drawing>
-              <wp:anchor behindDoc="0" distT="45720" distB="45720" distL="114300" distR="114300" simplePos="0" locked="0" layoutInCell="0" allowOverlap="1" relativeHeight="25" wp14:anchorId="3D43415C">
+              <wp:anchor behindDoc="0" distT="45720" distB="45720" distL="114300" distR="114300" simplePos="0" locked="0" layoutInCell="0" allowOverlap="1" relativeHeight="24" wp14:anchorId="3D43415C">
                 <wp:simplePos x="0" y="0"/>
                 <wp:positionH relativeFrom="page">
                   <wp:posOffset>194310</wp:posOffset>
@@ -226,7 +226,7 @@
         <mc:AlternateContent>
           <mc:Choice Requires="wps">
             <w:drawing>
-              <wp:anchor behindDoc="0" distT="45720" distB="45720" distL="113030" distR="114935" simplePos="0" locked="0" layoutInCell="0" allowOverlap="1" relativeHeight="27" wp14:anchorId="58C23128">
+              <wp:anchor behindDoc="0" distT="45720" distB="45720" distL="113030" distR="114935" simplePos="0" locked="0" layoutInCell="0" allowOverlap="1" relativeHeight="26" wp14:anchorId="58C23128">
                 <wp:simplePos x="0" y="0"/>
                 <wp:positionH relativeFrom="page">
                   <wp:posOffset>3094990</wp:posOffset>
@@ -341,7 +341,7 @@
         <mc:AlternateContent>
           <mc:Choice Requires="wps">
             <w:drawing>
-              <wp:anchor behindDoc="0" distT="45720" distB="45720" distL="114300" distR="113665" simplePos="0" locked="0" layoutInCell="0" allowOverlap="1" relativeHeight="29" wp14:anchorId="1BF25123">
+              <wp:anchor behindDoc="0" distT="45720" distB="45720" distL="114300" distR="113665" simplePos="0" locked="0" layoutInCell="0" allowOverlap="1" relativeHeight="28" wp14:anchorId="1BF25123">
                 <wp:simplePos x="0" y="0"/>
                 <wp:positionH relativeFrom="page">
                   <wp:posOffset>4992370</wp:posOffset>
@@ -456,7 +456,7 @@
         <mc:AlternateContent>
           <mc:Choice Requires="wps">
             <w:drawing>
-              <wp:anchor behindDoc="0" distT="45085" distB="45720" distL="114300" distR="114300" simplePos="0" locked="0" layoutInCell="0" allowOverlap="1" relativeHeight="31" wp14:anchorId="01DE2BF4">
+              <wp:anchor behindDoc="0" distT="45720" distB="46355" distL="114300" distR="114300" simplePos="0" locked="0" layoutInCell="0" allowOverlap="1" relativeHeight="30" wp14:anchorId="01DE2BF4">
                 <wp:simplePos x="0" y="0"/>
                 <wp:positionH relativeFrom="margin">
                   <wp:align>center</wp:align>
@@ -464,7 +464,7 @@
                 <wp:positionV relativeFrom="paragraph">
                   <wp:posOffset>1291590</wp:posOffset>
                 </wp:positionV>
-                <wp:extent cx="4528820" cy="476885"/>
+                <wp:extent cx="4528820" cy="1249680"/>
                 <wp:effectExtent l="0" t="0" r="0" b="0"/>
                 <wp:wrapSquare wrapText="bothSides"/>
                 <wp:docPr id="6" name="Text Box 2"/>
@@ -475,7 +475,7 @@
                       <wps:spPr>
                         <a:xfrm>
                           <a:off x="0" y="0"/>
-                          <a:ext cx="4528800" cy="477000"/>
+                          <a:ext cx="4528800" cy="1249560"/>
                         </a:xfrm>
                         <a:prstGeom prst="rect">
                           <a:avLst/>
@@ -500,8 +500,8 @@
                                 <w:b/>
                                 <w:bCs/>
                                 <w:color w:val="1D74BA"/>
-                                <w:sz w:val="44"/>
-                                <w:szCs w:val="44"/>
+                                <w:sz w:val="36"/>
+                                <w:szCs w:val="36"/>
                                 <w:lang w:val="en-MY"/>
                               </w:rPr>
                             </w:pPr>
@@ -510,8 +510,8 @@
                                 <w:b/>
                                 <w:bCs/>
                                 <w:color w:val="1D74BA"/>
-                                <w:sz w:val="44"/>
-                                <w:szCs w:val="44"/>
+                                <w:sz w:val="36"/>
+                                <w:szCs w:val="36"/>
                                 <w:lang w:val="en-MY"/>
                               </w:rPr>
                               <w:t>BrokerVerse OOTB Commercial Proposal Note</w:t>
@@ -546,7 +546,7 @@
           </mc:Choice>
           <mc:Fallback>
             <w:pict>
-              <v:rect id="shape_0" ID="Text Box 2" path="m0,0l-2147483645,0l-2147483645,-2147483646l0,-2147483646xe" stroked="f" o:allowincell="f" style="position:absolute;margin-left:47.35pt;margin-top:101.7pt;width:356.55pt;height:37.5pt;mso-wrap-style:square;v-text-anchor:top;mso-position-horizontal:center;mso-position-horizontal-relative:margin" wp14:anchorId="01DE2BF4">
+              <v:rect id="shape_0" ID="Text Box 2" path="m0,0l-2147483645,0l-2147483645,-2147483646l0,-2147483646xe" stroked="f" o:allowincell="f" style="position:absolute;margin-left:47.35pt;margin-top:101.7pt;width:356.55pt;height:98.35pt;mso-wrap-style:square;v-text-anchor:top;mso-position-horizontal:center;mso-position-horizontal-relative:margin" wp14:anchorId="01DE2BF4">
                 <v:fill o:detectmouseclick="t" on="false"/>
                 <v:stroke color="#3465a4" weight="9360" joinstyle="miter" endcap="flat"/>
                 <v:textbox>
@@ -558,8 +558,8 @@
                           <w:b/>
                           <w:bCs/>
                           <w:color w:val="1D74BA"/>
-                          <w:sz w:val="44"/>
-                          <w:szCs w:val="44"/>
+                          <w:sz w:val="36"/>
+                          <w:szCs w:val="36"/>
                           <w:lang w:val="en-MY"/>
                         </w:rPr>
                       </w:pPr>
@@ -568,8 +568,8 @@
                           <w:b/>
                           <w:bCs/>
                           <w:color w:val="1D74BA"/>
-                          <w:sz w:val="44"/>
-                          <w:szCs w:val="44"/>
+                          <w:sz w:val="36"/>
+                          <w:szCs w:val="36"/>
                           <w:lang w:val="en-MY"/>
                         </w:rPr>
                         <w:t>BrokerVerse OOTB Commercial Proposal Note</w:t>
@@ -601,7 +601,7 @@
         <mc:AlternateContent>
           <mc:Choice Requires="wps">
             <w:drawing>
-              <wp:anchor behindDoc="0" distT="45720" distB="50800" distL="114300" distR="114300" simplePos="0" locked="0" layoutInCell="0" allowOverlap="1" relativeHeight="33" wp14:anchorId="204C02CC">
+              <wp:anchor behindDoc="0" distT="45720" distB="50800" distL="114300" distR="114300" simplePos="0" locked="0" layoutInCell="0" allowOverlap="1" relativeHeight="32" wp14:anchorId="204C02CC">
                 <wp:simplePos x="0" y="0"/>
                 <wp:positionH relativeFrom="margin">
                   <wp:align>center</wp:align>
@@ -789,7 +789,7 @@
             </w:rPr>
             <w:fldChar w:fldCharType="separate"/>
           </w:r>
-          <w:hyperlink w:anchor="__RefHeading___Toc2431_2150771405">
+          <w:hyperlink w:anchor="__RefHeading___Toc5865_1649759004">
             <w:r>
               <w:rPr>
                 <w:webHidden/>
@@ -824,7 +824,7 @@
             </w:tabs>
             <w:rPr/>
           </w:pPr>
-          <w:hyperlink w:anchor="__RefHeading___Toc2433_2150771405">
+          <w:hyperlink w:anchor="__RefHeading___Toc5867_1649759004">
             <w:r>
               <w:rPr>
                 <w:webHidden/>
@@ -853,7 +853,7 @@
             </w:tabs>
             <w:rPr/>
           </w:pPr>
-          <w:hyperlink w:anchor="__RefHeading___Toc2435_2150771405">
+          <w:hyperlink w:anchor="__RefHeading___Toc5869_1649759004">
             <w:r>
               <w:rPr>
                 <w:webHidden/>
@@ -861,7 +861,7 @@
               </w:rPr>
               <w:t>3. Purpose and scope</w:t>
               <w:tab/>
-              <w:t>5</w:t>
+              <w:t>4</w:t>
             </w:r>
           </w:hyperlink>
         </w:p>
@@ -875,7 +875,7 @@
             </w:tabs>
             <w:rPr/>
           </w:pPr>
-          <w:hyperlink w:anchor="__RefHeading___Toc2437_2150771405">
+          <w:hyperlink w:anchor="__RefHeading___Toc5871_1649759004">
             <w:r>
               <w:rPr>
                 <w:webHidden/>
@@ -883,7 +883,7 @@
               </w:rPr>
               <w:t>4. Market context</w:t>
               <w:tab/>
-              <w:t>6</w:t>
+              <w:t>5</w:t>
             </w:r>
           </w:hyperlink>
         </w:p>
@@ -897,7 +897,7 @@
             </w:tabs>
             <w:rPr/>
           </w:pPr>
-          <w:hyperlink w:anchor="__RefHeading___Toc2439_2150771405">
+          <w:hyperlink w:anchor="__RefHeading___Toc5873_1649759004">
             <w:r>
               <w:rPr>
                 <w:webHidden/>
@@ -905,7 +905,7 @@
               </w:rPr>
               <w:t>4.1 The Philippine broker market</w:t>
               <w:tab/>
-              <w:t>6</w:t>
+              <w:t>5</w:t>
             </w:r>
           </w:hyperlink>
         </w:p>
@@ -919,7 +919,7 @@
             </w:tabs>
             <w:rPr/>
           </w:pPr>
-          <w:hyperlink w:anchor="__RefHeading___Toc2441_2150771405">
+          <w:hyperlink w:anchor="__RefHeading___Toc5875_1649759004">
             <w:r>
               <w:rPr>
                 <w:webHidden/>
@@ -927,7 +927,7 @@
               </w:rPr>
               <w:t>4.2 What the insurer ranking suggests</w:t>
               <w:tab/>
-              <w:t>6</w:t>
+              <w:t>5</w:t>
             </w:r>
           </w:hyperlink>
         </w:p>
@@ -941,7 +941,7 @@
             </w:tabs>
             <w:rPr/>
           </w:pPr>
-          <w:hyperlink w:anchor="__RefHeading___Toc2443_2150771405">
+          <w:hyperlink w:anchor="__RefHeading___Toc5877_1649759004">
             <w:r>
               <w:rPr>
                 <w:webHidden/>
@@ -949,7 +949,7 @@
               </w:rPr>
               <w:t>4.3 Affordability</w:t>
               <w:tab/>
-              <w:t>6</w:t>
+              <w:t>5</w:t>
             </w:r>
           </w:hyperlink>
         </w:p>
@@ -963,7 +963,7 @@
             </w:tabs>
             <w:rPr/>
           </w:pPr>
-          <w:hyperlink w:anchor="__RefHeading___Toc2445_2150771405">
+          <w:hyperlink w:anchor="__RefHeading___Toc5879_1649759004">
             <w:r>
               <w:rPr>
                 <w:webHidden/>
@@ -971,7 +971,7 @@
               </w:rPr>
               <w:t>5. Size tiers and user slabs</w:t>
               <w:tab/>
-              <w:t>7</w:t>
+              <w:t>6</w:t>
             </w:r>
           </w:hyperlink>
         </w:p>
@@ -985,7 +985,7 @@
             </w:tabs>
             <w:rPr/>
           </w:pPr>
-          <w:hyperlink w:anchor="__RefHeading___Toc2447_2150771405">
+          <w:hyperlink w:anchor="__RefHeading___Toc5881_1649759004">
             <w:r>
               <w:rPr>
                 <w:webHidden/>
@@ -993,7 +993,7 @@
               </w:rPr>
               <w:t>6. Model A: perpetual licence with AMC</w:t>
               <w:tab/>
-              <w:t>8</w:t>
+              <w:t>7</w:t>
             </w:r>
           </w:hyperlink>
         </w:p>
@@ -1007,7 +1007,7 @@
             </w:tabs>
             <w:rPr/>
           </w:pPr>
-          <w:hyperlink w:anchor="__RefHeading___Toc2449_2150771405">
+          <w:hyperlink w:anchor="__RefHeading___Toc5883_1649759004">
             <w:r>
               <w:rPr>
                 <w:webHidden/>
@@ -1015,7 +1015,7 @@
               </w:rPr>
               <w:t>6.1 Price points</w:t>
               <w:tab/>
-              <w:t>8</w:t>
+              <w:t>7</w:t>
             </w:r>
           </w:hyperlink>
         </w:p>
@@ -1029,7 +1029,7 @@
             </w:tabs>
             <w:rPr/>
           </w:pPr>
-          <w:hyperlink w:anchor="__RefHeading___Toc2451_2150771405">
+          <w:hyperlink w:anchor="__RefHeading___Toc5885_1649759004">
             <w:r>
               <w:rPr>
                 <w:webHidden/>
@@ -1037,7 +1037,7 @@
               </w:rPr>
               <w:t>6.2 Implementation fee</w:t>
               <w:tab/>
-              <w:t>8</w:t>
+              <w:t>7</w:t>
             </w:r>
           </w:hyperlink>
         </w:p>
@@ -1051,7 +1051,7 @@
             </w:tabs>
             <w:rPr/>
           </w:pPr>
-          <w:hyperlink w:anchor="__RefHeading___Toc2453_2150771405">
+          <w:hyperlink w:anchor="__RefHeading___Toc5887_1649759004">
             <w:r>
               <w:rPr>
                 <w:webHidden/>
@@ -1059,7 +1059,7 @@
               </w:rPr>
               <w:t>7. Model B: subscription</w:t>
               <w:tab/>
-              <w:t>9</w:t>
+              <w:t>8</w:t>
             </w:r>
           </w:hyperlink>
         </w:p>
@@ -1073,7 +1073,7 @@
             </w:tabs>
             <w:rPr/>
           </w:pPr>
-          <w:hyperlink w:anchor="__RefHeading___Toc2455_2150771405">
+          <w:hyperlink w:anchor="__RefHeading___Toc5889_1649759004">
             <w:r>
               <w:rPr>
                 <w:webHidden/>
@@ -1081,7 +1081,7 @@
               </w:rPr>
               <w:t>7.1 Price points</w:t>
               <w:tab/>
-              <w:t>9</w:t>
+              <w:t>8</w:t>
             </w:r>
           </w:hyperlink>
         </w:p>
@@ -1095,7 +1095,7 @@
             </w:tabs>
             <w:rPr/>
           </w:pPr>
-          <w:hyperlink w:anchor="__RefHeading___Toc2457_2150771405">
+          <w:hyperlink w:anchor="__RefHeading___Toc5891_1649759004">
             <w:r>
               <w:rPr>
                 <w:webHidden/>
@@ -1103,7 +1103,7 @@
               </w:rPr>
               <w:t>7.2 Break-even against the perpetual model</w:t>
               <w:tab/>
-              <w:t>9</w:t>
+              <w:t>8</w:t>
             </w:r>
           </w:hyperlink>
         </w:p>
@@ -1117,7 +1117,7 @@
             </w:tabs>
             <w:rPr/>
           </w:pPr>
-          <w:hyperlink w:anchor="__RefHeading___Toc2459_2150771405">
+          <w:hyperlink w:anchor="__RefHeading___Toc5893_1649759004">
             <w:r>
               <w:rPr>
                 <w:webHidden/>
@@ -1125,7 +1125,7 @@
               </w:rPr>
               <w:t>8. Positioning against the market</w:t>
               <w:tab/>
-              <w:t>10</w:t>
+              <w:t>9</w:t>
             </w:r>
           </w:hyperlink>
         </w:p>
@@ -1139,7 +1139,7 @@
             </w:tabs>
             <w:rPr/>
           </w:pPr>
-          <w:hyperlink w:anchor="__RefHeading___Toc2461_2150771405">
+          <w:hyperlink w:anchor="__RefHeading___Toc5895_1649759004">
             <w:r>
               <w:rPr>
                 <w:webHidden/>
@@ -1147,7 +1147,7 @@
               </w:rPr>
               <w:t>9. Infrastructure</w:t>
               <w:tab/>
-              <w:t>11</w:t>
+              <w:t>10</w:t>
             </w:r>
           </w:hyperlink>
         </w:p>
@@ -1161,7 +1161,7 @@
             </w:tabs>
             <w:rPr/>
           </w:pPr>
-          <w:hyperlink w:anchor="__RefHeading___Toc2463_2150771405">
+          <w:hyperlink w:anchor="__RefHeading___Toc5897_1649759004">
             <w:r>
               <w:rPr>
                 <w:webHidden/>
@@ -1169,7 +1169,7 @@
               </w:rPr>
               <w:t>10. Change requests</w:t>
               <w:tab/>
-              <w:t>12</w:t>
+              <w:t>11</w:t>
             </w:r>
           </w:hyperlink>
         </w:p>
@@ -1183,7 +1183,7 @@
             </w:tabs>
             <w:rPr/>
           </w:pPr>
-          <w:hyperlink w:anchor="__RefHeading___Toc2465_2150771405">
+          <w:hyperlink w:anchor="__RefHeading___Toc5899_1649759004">
             <w:r>
               <w:rPr>
                 <w:webHidden/>
@@ -1191,7 +1191,7 @@
               </w:rPr>
               <w:t>10.1 Day rates</w:t>
               <w:tab/>
-              <w:t>12</w:t>
+              <w:t>11</w:t>
             </w:r>
           </w:hyperlink>
         </w:p>
@@ -1205,7 +1205,7 @@
             </w:tabs>
             <w:rPr/>
           </w:pPr>
-          <w:hyperlink w:anchor="__RefHeading___Toc2467_2150771405">
+          <w:hyperlink w:anchor="__RefHeading___Toc5901_1649759004">
             <w:r>
               <w:rPr>
                 <w:webHidden/>
@@ -1213,7 +1213,7 @@
               </w:rPr>
               <w:t>10.2 Estimation method</w:t>
               <w:tab/>
-              <w:t>12</w:t>
+              <w:t>11</w:t>
             </w:r>
           </w:hyperlink>
         </w:p>
@@ -1227,7 +1227,7 @@
             </w:tabs>
             <w:rPr/>
           </w:pPr>
-          <w:hyperlink w:anchor="__RefHeading___Toc2469_2150771405">
+          <w:hyperlink w:anchor="__RefHeading___Toc5903_1649759004">
             <w:r>
               <w:rPr>
                 <w:webHidden/>
@@ -1235,7 +1235,7 @@
               </w:rPr>
               <w:t>11. Optional services</w:t>
               <w:tab/>
-              <w:t>13</w:t>
+              <w:t>12</w:t>
             </w:r>
           </w:hyperlink>
         </w:p>
@@ -1249,7 +1249,7 @@
             </w:tabs>
             <w:rPr/>
           </w:pPr>
-          <w:hyperlink w:anchor="__RefHeading___Toc2471_2150771405">
+          <w:hyperlink w:anchor="__RefHeading___Toc5905_1649759004">
             <w:r>
               <w:rPr>
                 <w:webHidden/>
@@ -1257,7 +1257,7 @@
               </w:rPr>
               <w:t>12. Sample quotes</w:t>
               <w:tab/>
-              <w:t>14</w:t>
+              <w:t>13</w:t>
             </w:r>
           </w:hyperlink>
         </w:p>
@@ -1271,7 +1271,7 @@
             </w:tabs>
             <w:rPr/>
           </w:pPr>
-          <w:hyperlink w:anchor="__RefHeading___Toc2473_2150771405">
+          <w:hyperlink w:anchor="__RefHeading___Toc5907_1649759004">
             <w:r>
               <w:rPr>
                 <w:webHidden/>
@@ -1279,7 +1279,7 @@
               </w:rPr>
               <w:t>13. Payment terms</w:t>
               <w:tab/>
-              <w:t>15</w:t>
+              <w:t>14</w:t>
             </w:r>
           </w:hyperlink>
         </w:p>
@@ -1293,7 +1293,7 @@
             </w:tabs>
             <w:rPr/>
           </w:pPr>
-          <w:hyperlink w:anchor="__RefHeading___Toc2475_2150771405">
+          <w:hyperlink w:anchor="__RefHeading___Toc5909_1649759004">
             <w:r>
               <w:rPr>
                 <w:webHidden/>
@@ -1301,7 +1301,7 @@
               </w:rPr>
               <w:t>14. Taxes</w:t>
               <w:tab/>
-              <w:t>16</w:t>
+              <w:t>15</w:t>
             </w:r>
           </w:hyperlink>
         </w:p>
@@ -1315,7 +1315,7 @@
             </w:tabs>
             <w:rPr/>
           </w:pPr>
-          <w:hyperlink w:anchor="__RefHeading___Toc2477_2150771405">
+          <w:hyperlink w:anchor="__RefHeading___Toc5911_1649759004">
             <w:r>
               <w:rPr>
                 <w:webHidden/>
@@ -1323,7 +1323,7 @@
               </w:rPr>
               <w:t>15. Validity and assumptions</w:t>
               <w:tab/>
-              <w:t>17</w:t>
+              <w:t>16</w:t>
             </w:r>
           </w:hyperlink>
         </w:p>
@@ -1337,7 +1337,7 @@
             </w:tabs>
             <w:rPr/>
           </w:pPr>
-          <w:hyperlink w:anchor="__RefHeading___Toc2479_2150771405">
+          <w:hyperlink w:anchor="__RefHeading___Toc5913_1649759004">
             <w:r>
               <w:rPr>
                 <w:webHidden/>
@@ -1345,7 +1345,7 @@
               </w:rPr>
               <w:t>16. Recommendation</w:t>
               <w:tab/>
-              <w:t>18</w:t>
+              <w:t>17</w:t>
             </w:r>
           </w:hyperlink>
         </w:p>
@@ -1359,7 +1359,7 @@
             </w:tabs>
             <w:rPr/>
           </w:pPr>
-          <w:hyperlink w:anchor="__RefHeading___Toc2481_2150771405">
+          <w:hyperlink w:anchor="__RefHeading___Toc5915_1649759004">
             <w:r>
               <w:rPr>
                 <w:webHidden/>
@@ -1374,7 +1374,7 @@
                 <w:rStyle w:val="IndexLink"/>
               </w:rPr>
               <w:tab/>
-              <w:t>19</w:t>
+              <w:t>18</w:t>
             </w:r>
           </w:hyperlink>
           <w:r>
@@ -1407,7 +1407,7 @@
       <w:r>
         <w:br w:type="page"/>
       </w:r>
-      <w:bookmarkStart w:id="0" w:name="__RefHeading___Toc2431_2150771405"/>
+      <w:bookmarkStart w:id="0" w:name="__RefHeading___Toc5865_1649759004"/>
       <w:bookmarkStart w:id="1" w:name="_Toc48319687"/>
       <w:bookmarkStart w:id="2" w:name="_Toc11824118"/>
       <w:bookmarkEnd w:id="0"/>
@@ -2052,7 +2052,7 @@
           <w:spacing w:val="0"/>
         </w:rPr>
       </w:pPr>
-      <w:bookmarkStart w:id="4" w:name="__RefHeading___Toc2433_2150771405"/>
+      <w:bookmarkStart w:id="4" w:name="__RefHeading___Toc5867_1649759004"/>
       <w:bookmarkStart w:id="5" w:name="_Toc233203388"/>
       <w:bookmarkEnd w:id="4"/>
       <w:r>
@@ -3508,16 +3508,14 @@
           <w:lang w:bidi="en-US"/>
         </w:rPr>
       </w:r>
-      <w:r>
-        <w:br w:type="page"/>
-      </w:r>
     </w:p>
     <w:p>
       <w:pPr>
         <w:pStyle w:val="Heading1"/>
+        <w:pageBreakBefore w:val="false"/>
         <w:rPr/>
       </w:pPr>
-      <w:bookmarkStart w:id="6" w:name="__RefHeading___Toc2435_2150771405"/>
+      <w:bookmarkStart w:id="6" w:name="__RefHeading___Toc5869_1649759004"/>
       <w:bookmarkEnd w:id="6"/>
       <w:r>
         <w:rPr>
@@ -3615,7 +3613,7 @@
         <w:pStyle w:val="Heading1"/>
         <w:rPr/>
       </w:pPr>
-      <w:bookmarkStart w:id="7" w:name="__RefHeading___Toc2437_2150771405"/>
+      <w:bookmarkStart w:id="7" w:name="__RefHeading___Toc5871_1649759004"/>
       <w:bookmarkEnd w:id="7"/>
       <w:r>
         <w:rPr>
@@ -3632,7 +3630,7 @@
         <w:pStyle w:val="Heading2"/>
         <w:rPr/>
       </w:pPr>
-      <w:bookmarkStart w:id="8" w:name="__RefHeading___Toc2439_2150771405"/>
+      <w:bookmarkStart w:id="8" w:name="__RefHeading___Toc5873_1649759004"/>
       <w:bookmarkEnd w:id="8"/>
       <w:r>
         <w:rPr>
@@ -3677,7 +3675,7 @@
     <w:tbl>
       <w:tblPr>
         <w:tblStyle w:val="TableGrid"/>
-        <w:tblW w:w="9027" w:type="dxa"/>
+        <w:tblW w:w="9015" w:type="dxa"/>
         <w:jc w:val="left"/>
         <w:tblInd w:w="0" w:type="dxa"/>
         <w:tblLayout w:type="fixed"/>
@@ -3690,9 +3688,9 @@
         <w:tblLook w:val="04a0" w:noHBand="0" w:noVBand="1" w:firstColumn="1" w:lastRow="0" w:lastColumn="0" w:firstRow="1"/>
       </w:tblPr>
       <w:tblGrid>
-        <w:gridCol w:w="3009"/>
-        <w:gridCol w:w="3009"/>
-        <w:gridCol w:w="3009"/>
+        <w:gridCol w:w="1123"/>
+        <w:gridCol w:w="5392"/>
+        <w:gridCol w:w="2500"/>
       </w:tblGrid>
       <w:tr>
         <w:trPr>
@@ -3700,7 +3698,7 @@
         </w:trPr>
         <w:tc>
           <w:tcPr>
-            <w:tcW w:w="3009" w:type="dxa"/>
+            <w:tcW w:w="1123" w:type="dxa"/>
             <w:tcBorders>
               <w:top w:val="single" w:sz="4" w:space="0" w:color="BFC7D1"/>
               <w:left w:val="single" w:sz="4" w:space="0" w:color="BFC7D1"/>
@@ -3739,7 +3737,7 @@
         </w:tc>
         <w:tc>
           <w:tcPr>
-            <w:tcW w:w="3009" w:type="dxa"/>
+            <w:tcW w:w="5392" w:type="dxa"/>
             <w:tcBorders>
               <w:top w:val="single" w:sz="4" w:space="0" w:color="BFC7D1"/>
               <w:left w:val="single" w:sz="4" w:space="0" w:color="BFC7D1"/>
@@ -3778,7 +3776,7 @@
         </w:tc>
         <w:tc>
           <w:tcPr>
-            <w:tcW w:w="3009" w:type="dxa"/>
+            <w:tcW w:w="2500" w:type="dxa"/>
             <w:tcBorders>
               <w:top w:val="single" w:sz="4" w:space="0" w:color="BFC7D1"/>
               <w:left w:val="single" w:sz="4" w:space="0" w:color="BFC7D1"/>
@@ -3820,7 +3818,7 @@
         <w:trPr/>
         <w:tc>
           <w:tcPr>
-            <w:tcW w:w="3009" w:type="dxa"/>
+            <w:tcW w:w="1123" w:type="dxa"/>
             <w:tcBorders>
               <w:top w:val="single" w:sz="4" w:space="0" w:color="BFC7D1"/>
               <w:left w:val="single" w:sz="4" w:space="0" w:color="BFC7D1"/>
@@ -3857,7 +3855,7 @@
         </w:tc>
         <w:tc>
           <w:tcPr>
-            <w:tcW w:w="3009" w:type="dxa"/>
+            <w:tcW w:w="5392" w:type="dxa"/>
             <w:tcBorders>
               <w:top w:val="single" w:sz="4" w:space="0" w:color="BFC7D1"/>
               <w:left w:val="single" w:sz="4" w:space="0" w:color="BFC7D1"/>
@@ -3894,7 +3892,7 @@
         </w:tc>
         <w:tc>
           <w:tcPr>
-            <w:tcW w:w="3009" w:type="dxa"/>
+            <w:tcW w:w="2500" w:type="dxa"/>
             <w:tcBorders>
               <w:top w:val="single" w:sz="4" w:space="0" w:color="BFC7D1"/>
               <w:left w:val="single" w:sz="4" w:space="0" w:color="BFC7D1"/>
@@ -3934,7 +3932,7 @@
         <w:trPr/>
         <w:tc>
           <w:tcPr>
-            <w:tcW w:w="3009" w:type="dxa"/>
+            <w:tcW w:w="1123" w:type="dxa"/>
             <w:tcBorders>
               <w:top w:val="single" w:sz="4" w:space="0" w:color="BFC7D1"/>
               <w:left w:val="single" w:sz="4" w:space="0" w:color="BFC7D1"/>
@@ -3971,7 +3969,7 @@
         </w:tc>
         <w:tc>
           <w:tcPr>
-            <w:tcW w:w="3009" w:type="dxa"/>
+            <w:tcW w:w="5392" w:type="dxa"/>
             <w:tcBorders>
               <w:top w:val="single" w:sz="4" w:space="0" w:color="BFC7D1"/>
               <w:left w:val="single" w:sz="4" w:space="0" w:color="BFC7D1"/>
@@ -4008,7 +4006,7 @@
         </w:tc>
         <w:tc>
           <w:tcPr>
-            <w:tcW w:w="3009" w:type="dxa"/>
+            <w:tcW w:w="2500" w:type="dxa"/>
             <w:tcBorders>
               <w:top w:val="single" w:sz="4" w:space="0" w:color="BFC7D1"/>
               <w:left w:val="single" w:sz="4" w:space="0" w:color="BFC7D1"/>
@@ -4048,7 +4046,7 @@
         <w:trPr/>
         <w:tc>
           <w:tcPr>
-            <w:tcW w:w="3009" w:type="dxa"/>
+            <w:tcW w:w="1123" w:type="dxa"/>
             <w:tcBorders>
               <w:top w:val="single" w:sz="4" w:space="0" w:color="BFC7D1"/>
               <w:left w:val="single" w:sz="4" w:space="0" w:color="BFC7D1"/>
@@ -4085,7 +4083,7 @@
         </w:tc>
         <w:tc>
           <w:tcPr>
-            <w:tcW w:w="3009" w:type="dxa"/>
+            <w:tcW w:w="5392" w:type="dxa"/>
             <w:tcBorders>
               <w:top w:val="single" w:sz="4" w:space="0" w:color="BFC7D1"/>
               <w:left w:val="single" w:sz="4" w:space="0" w:color="BFC7D1"/>
@@ -4122,7 +4120,7 @@
         </w:tc>
         <w:tc>
           <w:tcPr>
-            <w:tcW w:w="3009" w:type="dxa"/>
+            <w:tcW w:w="2500" w:type="dxa"/>
             <w:tcBorders>
               <w:top w:val="single" w:sz="4" w:space="0" w:color="BFC7D1"/>
               <w:left w:val="single" w:sz="4" w:space="0" w:color="BFC7D1"/>
@@ -4162,7 +4160,7 @@
         <w:trPr/>
         <w:tc>
           <w:tcPr>
-            <w:tcW w:w="3009" w:type="dxa"/>
+            <w:tcW w:w="1123" w:type="dxa"/>
             <w:tcBorders>
               <w:top w:val="single" w:sz="4" w:space="0" w:color="BFC7D1"/>
               <w:left w:val="single" w:sz="4" w:space="0" w:color="BFC7D1"/>
@@ -4199,7 +4197,7 @@
         </w:tc>
         <w:tc>
           <w:tcPr>
-            <w:tcW w:w="3009" w:type="dxa"/>
+            <w:tcW w:w="5392" w:type="dxa"/>
             <w:tcBorders>
               <w:top w:val="single" w:sz="4" w:space="0" w:color="BFC7D1"/>
               <w:left w:val="single" w:sz="4" w:space="0" w:color="BFC7D1"/>
@@ -4236,7 +4234,7 @@
         </w:tc>
         <w:tc>
           <w:tcPr>
-            <w:tcW w:w="3009" w:type="dxa"/>
+            <w:tcW w:w="2500" w:type="dxa"/>
             <w:tcBorders>
               <w:top w:val="single" w:sz="4" w:space="0" w:color="BFC7D1"/>
               <w:left w:val="single" w:sz="4" w:space="0" w:color="BFC7D1"/>
@@ -4276,7 +4274,7 @@
         <w:trPr/>
         <w:tc>
           <w:tcPr>
-            <w:tcW w:w="3009" w:type="dxa"/>
+            <w:tcW w:w="1123" w:type="dxa"/>
             <w:tcBorders>
               <w:top w:val="single" w:sz="4" w:space="0" w:color="BFC7D1"/>
               <w:left w:val="single" w:sz="4" w:space="0" w:color="BFC7D1"/>
@@ -4313,7 +4311,7 @@
         </w:tc>
         <w:tc>
           <w:tcPr>
-            <w:tcW w:w="3009" w:type="dxa"/>
+            <w:tcW w:w="5392" w:type="dxa"/>
             <w:tcBorders>
               <w:top w:val="single" w:sz="4" w:space="0" w:color="BFC7D1"/>
               <w:left w:val="single" w:sz="4" w:space="0" w:color="BFC7D1"/>
@@ -4350,7 +4348,7 @@
         </w:tc>
         <w:tc>
           <w:tcPr>
-            <w:tcW w:w="3009" w:type="dxa"/>
+            <w:tcW w:w="2500" w:type="dxa"/>
             <w:tcBorders>
               <w:top w:val="single" w:sz="4" w:space="0" w:color="BFC7D1"/>
               <w:left w:val="single" w:sz="4" w:space="0" w:color="BFC7D1"/>
@@ -4390,7 +4388,7 @@
         <w:trPr/>
         <w:tc>
           <w:tcPr>
-            <w:tcW w:w="3009" w:type="dxa"/>
+            <w:tcW w:w="1123" w:type="dxa"/>
             <w:tcBorders>
               <w:top w:val="single" w:sz="4" w:space="0" w:color="BFC7D1"/>
               <w:left w:val="single" w:sz="4" w:space="0" w:color="BFC7D1"/>
@@ -4427,7 +4425,7 @@
         </w:tc>
         <w:tc>
           <w:tcPr>
-            <w:tcW w:w="3009" w:type="dxa"/>
+            <w:tcW w:w="5392" w:type="dxa"/>
             <w:tcBorders>
               <w:top w:val="single" w:sz="4" w:space="0" w:color="BFC7D1"/>
               <w:left w:val="single" w:sz="4" w:space="0" w:color="BFC7D1"/>
@@ -4464,7 +4462,7 @@
         </w:tc>
         <w:tc>
           <w:tcPr>
-            <w:tcW w:w="3009" w:type="dxa"/>
+            <w:tcW w:w="2500" w:type="dxa"/>
             <w:tcBorders>
               <w:top w:val="single" w:sz="4" w:space="0" w:color="BFC7D1"/>
               <w:left w:val="single" w:sz="4" w:space="0" w:color="BFC7D1"/>
@@ -4504,7 +4502,7 @@
         <w:trPr/>
         <w:tc>
           <w:tcPr>
-            <w:tcW w:w="3009" w:type="dxa"/>
+            <w:tcW w:w="1123" w:type="dxa"/>
             <w:tcBorders>
               <w:top w:val="single" w:sz="4" w:space="0" w:color="BFC7D1"/>
               <w:left w:val="single" w:sz="4" w:space="0" w:color="BFC7D1"/>
@@ -4541,7 +4539,7 @@
         </w:tc>
         <w:tc>
           <w:tcPr>
-            <w:tcW w:w="3009" w:type="dxa"/>
+            <w:tcW w:w="5392" w:type="dxa"/>
             <w:tcBorders>
               <w:top w:val="single" w:sz="4" w:space="0" w:color="BFC7D1"/>
               <w:left w:val="single" w:sz="4" w:space="0" w:color="BFC7D1"/>
@@ -4578,7 +4576,7 @@
         </w:tc>
         <w:tc>
           <w:tcPr>
-            <w:tcW w:w="3009" w:type="dxa"/>
+            <w:tcW w:w="2500" w:type="dxa"/>
             <w:tcBorders>
               <w:top w:val="single" w:sz="4" w:space="0" w:color="BFC7D1"/>
               <w:left w:val="single" w:sz="4" w:space="0" w:color="BFC7D1"/>
@@ -4645,7 +4643,7 @@
         <w:pStyle w:val="Heading2"/>
         <w:rPr/>
       </w:pPr>
-      <w:bookmarkStart w:id="9" w:name="__RefHeading___Toc2441_2150771405"/>
+      <w:bookmarkStart w:id="9" w:name="__RefHeading___Toc5875_1649759004"/>
       <w:bookmarkEnd w:id="9"/>
       <w:r>
         <w:rPr>
@@ -4692,7 +4690,7 @@
         <w:pStyle w:val="Heading2"/>
         <w:rPr/>
       </w:pPr>
-      <w:bookmarkStart w:id="10" w:name="__RefHeading___Toc2443_2150771405"/>
+      <w:bookmarkStart w:id="10" w:name="__RefHeading___Toc5877_1649759004"/>
       <w:bookmarkEnd w:id="10"/>
       <w:r>
         <w:rPr>
@@ -4727,7 +4725,7 @@
         <w:pStyle w:val="Heading1"/>
         <w:rPr/>
       </w:pPr>
-      <w:bookmarkStart w:id="11" w:name="__RefHeading___Toc2445_2150771405"/>
+      <w:bookmarkStart w:id="11" w:name="__RefHeading___Toc5879_1649759004"/>
       <w:bookmarkEnd w:id="11"/>
       <w:r>
         <w:rPr>
@@ -4742,7 +4740,7 @@
     <w:tbl>
       <w:tblPr>
         <w:tblStyle w:val="TableGrid"/>
-        <w:tblW w:w="9028" w:type="dxa"/>
+        <w:tblW w:w="9014" w:type="dxa"/>
         <w:jc w:val="left"/>
         <w:tblInd w:w="0" w:type="dxa"/>
         <w:tblLayout w:type="fixed"/>
@@ -4755,10 +4753,10 @@
         <w:tblLook w:val="04a0" w:noHBand="0" w:noVBand="1" w:firstColumn="1" w:lastRow="0" w:lastColumn="0" w:firstRow="1"/>
       </w:tblPr>
       <w:tblGrid>
-        <w:gridCol w:w="2257"/>
-        <w:gridCol w:w="2257"/>
-        <w:gridCol w:w="2257"/>
-        <w:gridCol w:w="2256"/>
+        <w:gridCol w:w="1133"/>
+        <w:gridCol w:w="1113"/>
+        <w:gridCol w:w="4879"/>
+        <w:gridCol w:w="1888"/>
       </w:tblGrid>
       <w:tr>
         <w:trPr>
@@ -4766,7 +4764,7 @@
         </w:trPr>
         <w:tc>
           <w:tcPr>
-            <w:tcW w:w="2257" w:type="dxa"/>
+            <w:tcW w:w="1133" w:type="dxa"/>
             <w:tcBorders>
               <w:top w:val="single" w:sz="4" w:space="0" w:color="BFC7D1"/>
               <w:left w:val="single" w:sz="4" w:space="0" w:color="BFC7D1"/>
@@ -4805,7 +4803,7 @@
         </w:tc>
         <w:tc>
           <w:tcPr>
-            <w:tcW w:w="2257" w:type="dxa"/>
+            <w:tcW w:w="1113" w:type="dxa"/>
             <w:tcBorders>
               <w:top w:val="single" w:sz="4" w:space="0" w:color="BFC7D1"/>
               <w:left w:val="single" w:sz="4" w:space="0" w:color="BFC7D1"/>
@@ -4844,7 +4842,7 @@
         </w:tc>
         <w:tc>
           <w:tcPr>
-            <w:tcW w:w="2257" w:type="dxa"/>
+            <w:tcW w:w="4879" w:type="dxa"/>
             <w:tcBorders>
               <w:top w:val="single" w:sz="4" w:space="0" w:color="BFC7D1"/>
               <w:left w:val="single" w:sz="4" w:space="0" w:color="BFC7D1"/>
@@ -4883,7 +4881,7 @@
         </w:tc>
         <w:tc>
           <w:tcPr>
-            <w:tcW w:w="2256" w:type="dxa"/>
+            <w:tcW w:w="1888" w:type="dxa"/>
             <w:tcBorders>
               <w:top w:val="single" w:sz="4" w:space="0" w:color="BFC7D1"/>
               <w:left w:val="single" w:sz="4" w:space="0" w:color="BFC7D1"/>
@@ -4925,7 +4923,7 @@
         <w:trPr/>
         <w:tc>
           <w:tcPr>
-            <w:tcW w:w="2257" w:type="dxa"/>
+            <w:tcW w:w="1133" w:type="dxa"/>
             <w:tcBorders>
               <w:top w:val="single" w:sz="4" w:space="0" w:color="BFC7D1"/>
               <w:left w:val="single" w:sz="4" w:space="0" w:color="BFC7D1"/>
@@ -4962,7 +4960,7 @@
         </w:tc>
         <w:tc>
           <w:tcPr>
-            <w:tcW w:w="2257" w:type="dxa"/>
+            <w:tcW w:w="1113" w:type="dxa"/>
             <w:tcBorders>
               <w:top w:val="single" w:sz="4" w:space="0" w:color="BFC7D1"/>
               <w:left w:val="single" w:sz="4" w:space="0" w:color="BFC7D1"/>
@@ -4999,7 +4997,7 @@
         </w:tc>
         <w:tc>
           <w:tcPr>
-            <w:tcW w:w="2257" w:type="dxa"/>
+            <w:tcW w:w="4879" w:type="dxa"/>
             <w:tcBorders>
               <w:top w:val="single" w:sz="4" w:space="0" w:color="BFC7D1"/>
               <w:left w:val="single" w:sz="4" w:space="0" w:color="BFC7D1"/>
@@ -5036,7 +5034,7 @@
         </w:tc>
         <w:tc>
           <w:tcPr>
-            <w:tcW w:w="2256" w:type="dxa"/>
+            <w:tcW w:w="1888" w:type="dxa"/>
             <w:tcBorders>
               <w:top w:val="single" w:sz="4" w:space="0" w:color="BFC7D1"/>
               <w:left w:val="single" w:sz="4" w:space="0" w:color="BFC7D1"/>
@@ -5076,7 +5074,7 @@
         <w:trPr/>
         <w:tc>
           <w:tcPr>
-            <w:tcW w:w="2257" w:type="dxa"/>
+            <w:tcW w:w="1133" w:type="dxa"/>
             <w:tcBorders>
               <w:top w:val="single" w:sz="4" w:space="0" w:color="BFC7D1"/>
               <w:left w:val="single" w:sz="4" w:space="0" w:color="BFC7D1"/>
@@ -5113,7 +5111,7 @@
         </w:tc>
         <w:tc>
           <w:tcPr>
-            <w:tcW w:w="2257" w:type="dxa"/>
+            <w:tcW w:w="1113" w:type="dxa"/>
             <w:tcBorders>
               <w:top w:val="single" w:sz="4" w:space="0" w:color="BFC7D1"/>
               <w:left w:val="single" w:sz="4" w:space="0" w:color="BFC7D1"/>
@@ -5150,7 +5148,7 @@
         </w:tc>
         <w:tc>
           <w:tcPr>
-            <w:tcW w:w="2257" w:type="dxa"/>
+            <w:tcW w:w="4879" w:type="dxa"/>
             <w:tcBorders>
               <w:top w:val="single" w:sz="4" w:space="0" w:color="BFC7D1"/>
               <w:left w:val="single" w:sz="4" w:space="0" w:color="BFC7D1"/>
@@ -5187,7 +5185,7 @@
         </w:tc>
         <w:tc>
           <w:tcPr>
-            <w:tcW w:w="2256" w:type="dxa"/>
+            <w:tcW w:w="1888" w:type="dxa"/>
             <w:tcBorders>
               <w:top w:val="single" w:sz="4" w:space="0" w:color="BFC7D1"/>
               <w:left w:val="single" w:sz="4" w:space="0" w:color="BFC7D1"/>
@@ -5227,7 +5225,7 @@
         <w:trPr/>
         <w:tc>
           <w:tcPr>
-            <w:tcW w:w="2257" w:type="dxa"/>
+            <w:tcW w:w="1133" w:type="dxa"/>
             <w:tcBorders>
               <w:top w:val="single" w:sz="4" w:space="0" w:color="BFC7D1"/>
               <w:left w:val="single" w:sz="4" w:space="0" w:color="BFC7D1"/>
@@ -5264,7 +5262,7 @@
         </w:tc>
         <w:tc>
           <w:tcPr>
-            <w:tcW w:w="2257" w:type="dxa"/>
+            <w:tcW w:w="1113" w:type="dxa"/>
             <w:tcBorders>
               <w:top w:val="single" w:sz="4" w:space="0" w:color="BFC7D1"/>
               <w:left w:val="single" w:sz="4" w:space="0" w:color="BFC7D1"/>
@@ -5301,7 +5299,7 @@
         </w:tc>
         <w:tc>
           <w:tcPr>
-            <w:tcW w:w="2257" w:type="dxa"/>
+            <w:tcW w:w="4879" w:type="dxa"/>
             <w:tcBorders>
               <w:top w:val="single" w:sz="4" w:space="0" w:color="BFC7D1"/>
               <w:left w:val="single" w:sz="4" w:space="0" w:color="BFC7D1"/>
@@ -5338,7 +5336,7 @@
         </w:tc>
         <w:tc>
           <w:tcPr>
-            <w:tcW w:w="2256" w:type="dxa"/>
+            <w:tcW w:w="1888" w:type="dxa"/>
             <w:tcBorders>
               <w:top w:val="single" w:sz="4" w:space="0" w:color="BFC7D1"/>
               <w:left w:val="single" w:sz="4" w:space="0" w:color="BFC7D1"/>
@@ -5378,7 +5376,7 @@
         <w:trPr/>
         <w:tc>
           <w:tcPr>
-            <w:tcW w:w="2257" w:type="dxa"/>
+            <w:tcW w:w="1133" w:type="dxa"/>
             <w:tcBorders>
               <w:top w:val="single" w:sz="4" w:space="0" w:color="BFC7D1"/>
               <w:left w:val="single" w:sz="4" w:space="0" w:color="BFC7D1"/>
@@ -5415,7 +5413,7 @@
         </w:tc>
         <w:tc>
           <w:tcPr>
-            <w:tcW w:w="2257" w:type="dxa"/>
+            <w:tcW w:w="1113" w:type="dxa"/>
             <w:tcBorders>
               <w:top w:val="single" w:sz="4" w:space="0" w:color="BFC7D1"/>
               <w:left w:val="single" w:sz="4" w:space="0" w:color="BFC7D1"/>
@@ -5452,7 +5450,7 @@
         </w:tc>
         <w:tc>
           <w:tcPr>
-            <w:tcW w:w="2257" w:type="dxa"/>
+            <w:tcW w:w="4879" w:type="dxa"/>
             <w:tcBorders>
               <w:top w:val="single" w:sz="4" w:space="0" w:color="BFC7D1"/>
               <w:left w:val="single" w:sz="4" w:space="0" w:color="BFC7D1"/>
@@ -5489,7 +5487,7 @@
         </w:tc>
         <w:tc>
           <w:tcPr>
-            <w:tcW w:w="2256" w:type="dxa"/>
+            <w:tcW w:w="1888" w:type="dxa"/>
             <w:tcBorders>
               <w:top w:val="single" w:sz="4" w:space="0" w:color="BFC7D1"/>
               <w:left w:val="single" w:sz="4" w:space="0" w:color="BFC7D1"/>
@@ -5574,7 +5572,7 @@
         <w:pStyle w:val="Heading1"/>
         <w:rPr/>
       </w:pPr>
-      <w:bookmarkStart w:id="12" w:name="__RefHeading___Toc2447_2150771405"/>
+      <w:bookmarkStart w:id="12" w:name="__RefHeading___Toc5881_1649759004"/>
       <w:bookmarkEnd w:id="12"/>
       <w:r>
         <w:rPr>
@@ -5591,7 +5589,7 @@
         <w:pStyle w:val="Heading2"/>
         <w:rPr/>
       </w:pPr>
-      <w:bookmarkStart w:id="13" w:name="__RefHeading___Toc2449_2150771405"/>
+      <w:bookmarkStart w:id="13" w:name="__RefHeading___Toc5883_1649759004"/>
       <w:bookmarkEnd w:id="13"/>
       <w:r>
         <w:rPr>
@@ -5606,7 +5604,7 @@
     <w:tbl>
       <w:tblPr>
         <w:tblStyle w:val="TableGrid"/>
-        <w:tblW w:w="9028" w:type="dxa"/>
+        <w:tblW w:w="9014" w:type="dxa"/>
         <w:jc w:val="left"/>
         <w:tblInd w:w="0" w:type="dxa"/>
         <w:tblLayout w:type="fixed"/>
@@ -5619,10 +5617,10 @@
         <w:tblLook w:val="04a0" w:noHBand="0" w:noVBand="1" w:firstColumn="1" w:lastRow="0" w:lastColumn="0" w:firstRow="1"/>
       </w:tblPr>
       <w:tblGrid>
-        <w:gridCol w:w="2257"/>
-        <w:gridCol w:w="2257"/>
-        <w:gridCol w:w="2257"/>
-        <w:gridCol w:w="2256"/>
+        <w:gridCol w:w="1133"/>
+        <w:gridCol w:w="2412"/>
+        <w:gridCol w:w="1375"/>
+        <w:gridCol w:w="4093"/>
       </w:tblGrid>
       <w:tr>
         <w:trPr>
@@ -5630,7 +5628,7 @@
         </w:trPr>
         <w:tc>
           <w:tcPr>
-            <w:tcW w:w="2257" w:type="dxa"/>
+            <w:tcW w:w="1133" w:type="dxa"/>
             <w:tcBorders>
               <w:top w:val="single" w:sz="4" w:space="0" w:color="BFC7D1"/>
               <w:left w:val="single" w:sz="4" w:space="0" w:color="BFC7D1"/>
@@ -5669,7 +5667,7 @@
         </w:tc>
         <w:tc>
           <w:tcPr>
-            <w:tcW w:w="2257" w:type="dxa"/>
+            <w:tcW w:w="2412" w:type="dxa"/>
             <w:tcBorders>
               <w:top w:val="single" w:sz="4" w:space="0" w:color="BFC7D1"/>
               <w:left w:val="single" w:sz="4" w:space="0" w:color="BFC7D1"/>
@@ -5708,7 +5706,7 @@
         </w:tc>
         <w:tc>
           <w:tcPr>
-            <w:tcW w:w="2257" w:type="dxa"/>
+            <w:tcW w:w="1375" w:type="dxa"/>
             <w:tcBorders>
               <w:top w:val="single" w:sz="4" w:space="0" w:color="BFC7D1"/>
               <w:left w:val="single" w:sz="4" w:space="0" w:color="BFC7D1"/>
@@ -5747,7 +5745,7 @@
         </w:tc>
         <w:tc>
           <w:tcPr>
-            <w:tcW w:w="2256" w:type="dxa"/>
+            <w:tcW w:w="4093" w:type="dxa"/>
             <w:tcBorders>
               <w:top w:val="single" w:sz="4" w:space="0" w:color="BFC7D1"/>
               <w:left w:val="single" w:sz="4" w:space="0" w:color="BFC7D1"/>
@@ -5789,7 +5787,7 @@
         <w:trPr/>
         <w:tc>
           <w:tcPr>
-            <w:tcW w:w="2257" w:type="dxa"/>
+            <w:tcW w:w="1133" w:type="dxa"/>
             <w:tcBorders>
               <w:top w:val="single" w:sz="4" w:space="0" w:color="BFC7D1"/>
               <w:left w:val="single" w:sz="4" w:space="0" w:color="BFC7D1"/>
@@ -5826,7 +5824,7 @@
         </w:tc>
         <w:tc>
           <w:tcPr>
-            <w:tcW w:w="2257" w:type="dxa"/>
+            <w:tcW w:w="2412" w:type="dxa"/>
             <w:tcBorders>
               <w:top w:val="single" w:sz="4" w:space="0" w:color="BFC7D1"/>
               <w:left w:val="single" w:sz="4" w:space="0" w:color="BFC7D1"/>
@@ -5863,7 +5861,7 @@
         </w:tc>
         <w:tc>
           <w:tcPr>
-            <w:tcW w:w="2257" w:type="dxa"/>
+            <w:tcW w:w="1375" w:type="dxa"/>
             <w:tcBorders>
               <w:top w:val="single" w:sz="4" w:space="0" w:color="BFC7D1"/>
               <w:left w:val="single" w:sz="4" w:space="0" w:color="BFC7D1"/>
@@ -5900,7 +5898,7 @@
         </w:tc>
         <w:tc>
           <w:tcPr>
-            <w:tcW w:w="2256" w:type="dxa"/>
+            <w:tcW w:w="4093" w:type="dxa"/>
             <w:tcBorders>
               <w:top w:val="single" w:sz="4" w:space="0" w:color="BFC7D1"/>
               <w:left w:val="single" w:sz="4" w:space="0" w:color="BFC7D1"/>
@@ -5940,7 +5938,7 @@
         <w:trPr/>
         <w:tc>
           <w:tcPr>
-            <w:tcW w:w="2257" w:type="dxa"/>
+            <w:tcW w:w="1133" w:type="dxa"/>
             <w:tcBorders>
               <w:top w:val="single" w:sz="4" w:space="0" w:color="BFC7D1"/>
               <w:left w:val="single" w:sz="4" w:space="0" w:color="BFC7D1"/>
@@ -5977,7 +5975,7 @@
         </w:tc>
         <w:tc>
           <w:tcPr>
-            <w:tcW w:w="2257" w:type="dxa"/>
+            <w:tcW w:w="2412" w:type="dxa"/>
             <w:tcBorders>
               <w:top w:val="single" w:sz="4" w:space="0" w:color="BFC7D1"/>
               <w:left w:val="single" w:sz="4" w:space="0" w:color="BFC7D1"/>
@@ -6014,7 +6012,7 @@
         </w:tc>
         <w:tc>
           <w:tcPr>
-            <w:tcW w:w="2257" w:type="dxa"/>
+            <w:tcW w:w="1375" w:type="dxa"/>
             <w:tcBorders>
               <w:top w:val="single" w:sz="4" w:space="0" w:color="BFC7D1"/>
               <w:left w:val="single" w:sz="4" w:space="0" w:color="BFC7D1"/>
@@ -6051,7 +6049,7 @@
         </w:tc>
         <w:tc>
           <w:tcPr>
-            <w:tcW w:w="2256" w:type="dxa"/>
+            <w:tcW w:w="4093" w:type="dxa"/>
             <w:tcBorders>
               <w:top w:val="single" w:sz="4" w:space="0" w:color="BFC7D1"/>
               <w:left w:val="single" w:sz="4" w:space="0" w:color="BFC7D1"/>
@@ -6091,7 +6089,7 @@
         <w:trPr/>
         <w:tc>
           <w:tcPr>
-            <w:tcW w:w="2257" w:type="dxa"/>
+            <w:tcW w:w="1133" w:type="dxa"/>
             <w:tcBorders>
               <w:top w:val="single" w:sz="4" w:space="0" w:color="BFC7D1"/>
               <w:left w:val="single" w:sz="4" w:space="0" w:color="BFC7D1"/>
@@ -6128,7 +6126,7 @@
         </w:tc>
         <w:tc>
           <w:tcPr>
-            <w:tcW w:w="2257" w:type="dxa"/>
+            <w:tcW w:w="2412" w:type="dxa"/>
             <w:tcBorders>
               <w:top w:val="single" w:sz="4" w:space="0" w:color="BFC7D1"/>
               <w:left w:val="single" w:sz="4" w:space="0" w:color="BFC7D1"/>
@@ -6165,7 +6163,7 @@
         </w:tc>
         <w:tc>
           <w:tcPr>
-            <w:tcW w:w="2257" w:type="dxa"/>
+            <w:tcW w:w="1375" w:type="dxa"/>
             <w:tcBorders>
               <w:top w:val="single" w:sz="4" w:space="0" w:color="BFC7D1"/>
               <w:left w:val="single" w:sz="4" w:space="0" w:color="BFC7D1"/>
@@ -6202,7 +6200,7 @@
         </w:tc>
         <w:tc>
           <w:tcPr>
-            <w:tcW w:w="2256" w:type="dxa"/>
+            <w:tcW w:w="4093" w:type="dxa"/>
             <w:tcBorders>
               <w:top w:val="single" w:sz="4" w:space="0" w:color="BFC7D1"/>
               <w:left w:val="single" w:sz="4" w:space="0" w:color="BFC7D1"/>
@@ -6242,7 +6240,7 @@
         <w:trPr/>
         <w:tc>
           <w:tcPr>
-            <w:tcW w:w="2257" w:type="dxa"/>
+            <w:tcW w:w="1133" w:type="dxa"/>
             <w:tcBorders>
               <w:top w:val="single" w:sz="4" w:space="0" w:color="BFC7D1"/>
               <w:left w:val="single" w:sz="4" w:space="0" w:color="BFC7D1"/>
@@ -6279,7 +6277,7 @@
         </w:tc>
         <w:tc>
           <w:tcPr>
-            <w:tcW w:w="2257" w:type="dxa"/>
+            <w:tcW w:w="2412" w:type="dxa"/>
             <w:tcBorders>
               <w:top w:val="single" w:sz="4" w:space="0" w:color="BFC7D1"/>
               <w:left w:val="single" w:sz="4" w:space="0" w:color="BFC7D1"/>
@@ -6316,7 +6314,7 @@
         </w:tc>
         <w:tc>
           <w:tcPr>
-            <w:tcW w:w="2257" w:type="dxa"/>
+            <w:tcW w:w="1375" w:type="dxa"/>
             <w:tcBorders>
               <w:top w:val="single" w:sz="4" w:space="0" w:color="BFC7D1"/>
               <w:left w:val="single" w:sz="4" w:space="0" w:color="BFC7D1"/>
@@ -6353,7 +6351,7 @@
         </w:tc>
         <w:tc>
           <w:tcPr>
-            <w:tcW w:w="2256" w:type="dxa"/>
+            <w:tcW w:w="4093" w:type="dxa"/>
             <w:tcBorders>
               <w:top w:val="single" w:sz="4" w:space="0" w:color="BFC7D1"/>
               <w:left w:val="single" w:sz="4" w:space="0" w:color="BFC7D1"/>
@@ -6462,7 +6460,7 @@
         <w:pStyle w:val="Heading2"/>
         <w:rPr/>
       </w:pPr>
-      <w:bookmarkStart w:id="14" w:name="__RefHeading___Toc2451_2150771405"/>
+      <w:bookmarkStart w:id="14" w:name="__RefHeading___Toc5885_1649759004"/>
       <w:bookmarkEnd w:id="14"/>
       <w:r>
         <w:rPr>
@@ -6573,7 +6571,7 @@
           <w:color w:val="101820"/>
           <w:sz w:val="21"/>
         </w:rPr>
-        <w:t>The implementation includes configuration, data load by the broker with the standard upload templates (about 40 templates are delivered with the product), the training days included for the tier, UAT support, go-live support and four weeks of hypercare. The man-day counts are estimates for the OOTB version.</w:t>
+        <w:t>The implementation includes configuration, data load by the broker with the standard upload templates (about 40 templates are delivered with the product), the training days included for the tier, UAT support, go-live support and hypercare of 2 weeks (Small), 3 weeks (Medium) or 4 to 6 weeks (Large and Enterprise), extended to cover the first month-end close. The man-day counts are estimates for the OOTB version.</w:t>
       </w:r>
       <w:r>
         <w:br w:type="page"/>
@@ -6584,7 +6582,7 @@
         <w:pStyle w:val="Heading1"/>
         <w:rPr/>
       </w:pPr>
-      <w:bookmarkStart w:id="15" w:name="__RefHeading___Toc2453_2150771405"/>
+      <w:bookmarkStart w:id="15" w:name="__RefHeading___Toc5887_1649759004"/>
       <w:bookmarkEnd w:id="15"/>
       <w:r>
         <w:rPr>
@@ -6601,7 +6599,7 @@
         <w:pStyle w:val="Heading2"/>
         <w:rPr/>
       </w:pPr>
-      <w:bookmarkStart w:id="16" w:name="__RefHeading___Toc2455_2150771405"/>
+      <w:bookmarkStart w:id="16" w:name="__RefHeading___Toc5889_1649759004"/>
       <w:bookmarkEnd w:id="16"/>
       <w:r>
         <w:rPr>
@@ -6616,7 +6614,7 @@
     <w:tbl>
       <w:tblPr>
         <w:tblStyle w:val="TableGrid"/>
-        <w:tblW w:w="9028" w:type="dxa"/>
+        <w:tblW w:w="9014" w:type="dxa"/>
         <w:jc w:val="left"/>
         <w:tblInd w:w="0" w:type="dxa"/>
         <w:tblLayout w:type="fixed"/>
@@ -6629,10 +6627,10 @@
         <w:tblLook w:val="04a0" w:noHBand="0" w:noVBand="1" w:firstColumn="1" w:lastRow="0" w:lastColumn="0" w:firstRow="1"/>
       </w:tblPr>
       <w:tblGrid>
-        <w:gridCol w:w="2257"/>
-        <w:gridCol w:w="2257"/>
-        <w:gridCol w:w="2257"/>
-        <w:gridCol w:w="2256"/>
+        <w:gridCol w:w="1186"/>
+        <w:gridCol w:w="3677"/>
+        <w:gridCol w:w="1542"/>
+        <w:gridCol w:w="2608"/>
       </w:tblGrid>
       <w:tr>
         <w:trPr>
@@ -6640,7 +6638,7 @@
         </w:trPr>
         <w:tc>
           <w:tcPr>
-            <w:tcW w:w="2257" w:type="dxa"/>
+            <w:tcW w:w="1186" w:type="dxa"/>
             <w:tcBorders>
               <w:top w:val="single" w:sz="4" w:space="0" w:color="BFC7D1"/>
               <w:left w:val="single" w:sz="4" w:space="0" w:color="BFC7D1"/>
@@ -6679,7 +6677,7 @@
         </w:tc>
         <w:tc>
           <w:tcPr>
-            <w:tcW w:w="2257" w:type="dxa"/>
+            <w:tcW w:w="3677" w:type="dxa"/>
             <w:tcBorders>
               <w:top w:val="single" w:sz="4" w:space="0" w:color="BFC7D1"/>
               <w:left w:val="single" w:sz="4" w:space="0" w:color="BFC7D1"/>
@@ -6718,7 +6716,7 @@
         </w:tc>
         <w:tc>
           <w:tcPr>
-            <w:tcW w:w="2257" w:type="dxa"/>
+            <w:tcW w:w="1542" w:type="dxa"/>
             <w:tcBorders>
               <w:top w:val="single" w:sz="4" w:space="0" w:color="BFC7D1"/>
               <w:left w:val="single" w:sz="4" w:space="0" w:color="BFC7D1"/>
@@ -6757,7 +6755,7 @@
         </w:tc>
         <w:tc>
           <w:tcPr>
-            <w:tcW w:w="2256" w:type="dxa"/>
+            <w:tcW w:w="2608" w:type="dxa"/>
             <w:tcBorders>
               <w:top w:val="single" w:sz="4" w:space="0" w:color="BFC7D1"/>
               <w:left w:val="single" w:sz="4" w:space="0" w:color="BFC7D1"/>
@@ -6799,7 +6797,7 @@
         <w:trPr/>
         <w:tc>
           <w:tcPr>
-            <w:tcW w:w="2257" w:type="dxa"/>
+            <w:tcW w:w="1186" w:type="dxa"/>
             <w:tcBorders>
               <w:top w:val="single" w:sz="4" w:space="0" w:color="BFC7D1"/>
               <w:left w:val="single" w:sz="4" w:space="0" w:color="BFC7D1"/>
@@ -6836,7 +6834,7 @@
         </w:tc>
         <w:tc>
           <w:tcPr>
-            <w:tcW w:w="2257" w:type="dxa"/>
+            <w:tcW w:w="3677" w:type="dxa"/>
             <w:tcBorders>
               <w:top w:val="single" w:sz="4" w:space="0" w:color="BFC7D1"/>
               <w:left w:val="single" w:sz="4" w:space="0" w:color="BFC7D1"/>
@@ -6873,7 +6871,7 @@
         </w:tc>
         <w:tc>
           <w:tcPr>
-            <w:tcW w:w="2257" w:type="dxa"/>
+            <w:tcW w:w="1542" w:type="dxa"/>
             <w:tcBorders>
               <w:top w:val="single" w:sz="4" w:space="0" w:color="BFC7D1"/>
               <w:left w:val="single" w:sz="4" w:space="0" w:color="BFC7D1"/>
@@ -6910,7 +6908,7 @@
         </w:tc>
         <w:tc>
           <w:tcPr>
-            <w:tcW w:w="2256" w:type="dxa"/>
+            <w:tcW w:w="2608" w:type="dxa"/>
             <w:tcBorders>
               <w:top w:val="single" w:sz="4" w:space="0" w:color="BFC7D1"/>
               <w:left w:val="single" w:sz="4" w:space="0" w:color="BFC7D1"/>
@@ -6950,7 +6948,7 @@
         <w:trPr/>
         <w:tc>
           <w:tcPr>
-            <w:tcW w:w="2257" w:type="dxa"/>
+            <w:tcW w:w="1186" w:type="dxa"/>
             <w:tcBorders>
               <w:top w:val="single" w:sz="4" w:space="0" w:color="BFC7D1"/>
               <w:left w:val="single" w:sz="4" w:space="0" w:color="BFC7D1"/>
@@ -6987,7 +6985,7 @@
         </w:tc>
         <w:tc>
           <w:tcPr>
-            <w:tcW w:w="2257" w:type="dxa"/>
+            <w:tcW w:w="3677" w:type="dxa"/>
             <w:tcBorders>
               <w:top w:val="single" w:sz="4" w:space="0" w:color="BFC7D1"/>
               <w:left w:val="single" w:sz="4" w:space="0" w:color="BFC7D1"/>
@@ -7024,7 +7022,7 @@
         </w:tc>
         <w:tc>
           <w:tcPr>
-            <w:tcW w:w="2257" w:type="dxa"/>
+            <w:tcW w:w="1542" w:type="dxa"/>
             <w:tcBorders>
               <w:top w:val="single" w:sz="4" w:space="0" w:color="BFC7D1"/>
               <w:left w:val="single" w:sz="4" w:space="0" w:color="BFC7D1"/>
@@ -7061,7 +7059,7 @@
         </w:tc>
         <w:tc>
           <w:tcPr>
-            <w:tcW w:w="2256" w:type="dxa"/>
+            <w:tcW w:w="2608" w:type="dxa"/>
             <w:tcBorders>
               <w:top w:val="single" w:sz="4" w:space="0" w:color="BFC7D1"/>
               <w:left w:val="single" w:sz="4" w:space="0" w:color="BFC7D1"/>
@@ -7101,7 +7099,7 @@
         <w:trPr/>
         <w:tc>
           <w:tcPr>
-            <w:tcW w:w="2257" w:type="dxa"/>
+            <w:tcW w:w="1186" w:type="dxa"/>
             <w:tcBorders>
               <w:top w:val="single" w:sz="4" w:space="0" w:color="BFC7D1"/>
               <w:left w:val="single" w:sz="4" w:space="0" w:color="BFC7D1"/>
@@ -7138,7 +7136,7 @@
         </w:tc>
         <w:tc>
           <w:tcPr>
-            <w:tcW w:w="2257" w:type="dxa"/>
+            <w:tcW w:w="3677" w:type="dxa"/>
             <w:tcBorders>
               <w:top w:val="single" w:sz="4" w:space="0" w:color="BFC7D1"/>
               <w:left w:val="single" w:sz="4" w:space="0" w:color="BFC7D1"/>
@@ -7175,7 +7173,7 @@
         </w:tc>
         <w:tc>
           <w:tcPr>
-            <w:tcW w:w="2257" w:type="dxa"/>
+            <w:tcW w:w="1542" w:type="dxa"/>
             <w:tcBorders>
               <w:top w:val="single" w:sz="4" w:space="0" w:color="BFC7D1"/>
               <w:left w:val="single" w:sz="4" w:space="0" w:color="BFC7D1"/>
@@ -7212,7 +7210,7 @@
         </w:tc>
         <w:tc>
           <w:tcPr>
-            <w:tcW w:w="2256" w:type="dxa"/>
+            <w:tcW w:w="2608" w:type="dxa"/>
             <w:tcBorders>
               <w:top w:val="single" w:sz="4" w:space="0" w:color="BFC7D1"/>
               <w:left w:val="single" w:sz="4" w:space="0" w:color="BFC7D1"/>
@@ -7252,7 +7250,7 @@
         <w:trPr/>
         <w:tc>
           <w:tcPr>
-            <w:tcW w:w="2257" w:type="dxa"/>
+            <w:tcW w:w="1186" w:type="dxa"/>
             <w:tcBorders>
               <w:top w:val="single" w:sz="4" w:space="0" w:color="BFC7D1"/>
               <w:left w:val="single" w:sz="4" w:space="0" w:color="BFC7D1"/>
@@ -7289,7 +7287,7 @@
         </w:tc>
         <w:tc>
           <w:tcPr>
-            <w:tcW w:w="2257" w:type="dxa"/>
+            <w:tcW w:w="3677" w:type="dxa"/>
             <w:tcBorders>
               <w:top w:val="single" w:sz="4" w:space="0" w:color="BFC7D1"/>
               <w:left w:val="single" w:sz="4" w:space="0" w:color="BFC7D1"/>
@@ -7326,7 +7324,7 @@
         </w:tc>
         <w:tc>
           <w:tcPr>
-            <w:tcW w:w="2257" w:type="dxa"/>
+            <w:tcW w:w="1542" w:type="dxa"/>
             <w:tcBorders>
               <w:top w:val="single" w:sz="4" w:space="0" w:color="BFC7D1"/>
               <w:left w:val="single" w:sz="4" w:space="0" w:color="BFC7D1"/>
@@ -7363,7 +7361,7 @@
         </w:tc>
         <w:tc>
           <w:tcPr>
-            <w:tcW w:w="2256" w:type="dxa"/>
+            <w:tcW w:w="2608" w:type="dxa"/>
             <w:tcBorders>
               <w:top w:val="single" w:sz="4" w:space="0" w:color="BFC7D1"/>
               <w:left w:val="single" w:sz="4" w:space="0" w:color="BFC7D1"/>
@@ -7491,7 +7489,7 @@
         <w:pStyle w:val="Heading2"/>
         <w:rPr/>
       </w:pPr>
-      <w:bookmarkStart w:id="17" w:name="__RefHeading___Toc2457_2150771405"/>
+      <w:bookmarkStart w:id="17" w:name="__RefHeading___Toc5891_1649759004"/>
       <w:bookmarkEnd w:id="17"/>
       <w:r>
         <w:rPr>
@@ -7521,7 +7519,7 @@
     <w:tbl>
       <w:tblPr>
         <w:tblStyle w:val="TableGrid"/>
-        <w:tblW w:w="9028" w:type="dxa"/>
+        <w:tblW w:w="9015" w:type="dxa"/>
         <w:jc w:val="left"/>
         <w:tblInd w:w="0" w:type="dxa"/>
         <w:tblLayout w:type="fixed"/>
@@ -7534,10 +7532,10 @@
         <w:tblLook w:val="04a0" w:noHBand="0" w:noVBand="1" w:firstColumn="1" w:lastRow="0" w:lastColumn="0" w:firstRow="1"/>
       </w:tblPr>
       <w:tblGrid>
-        <w:gridCol w:w="2257"/>
-        <w:gridCol w:w="2257"/>
-        <w:gridCol w:w="2257"/>
-        <w:gridCol w:w="2256"/>
+        <w:gridCol w:w="2753"/>
+        <w:gridCol w:w="2261"/>
+        <w:gridCol w:w="2639"/>
+        <w:gridCol w:w="1361"/>
       </w:tblGrid>
       <w:tr>
         <w:trPr>
@@ -7545,7 +7543,7 @@
         </w:trPr>
         <w:tc>
           <w:tcPr>
-            <w:tcW w:w="2257" w:type="dxa"/>
+            <w:tcW w:w="2753" w:type="dxa"/>
             <w:tcBorders>
               <w:top w:val="single" w:sz="4" w:space="0" w:color="BFC7D1"/>
               <w:left w:val="single" w:sz="4" w:space="0" w:color="BFC7D1"/>
@@ -7584,7 +7582,7 @@
         </w:tc>
         <w:tc>
           <w:tcPr>
-            <w:tcW w:w="2257" w:type="dxa"/>
+            <w:tcW w:w="2261" w:type="dxa"/>
             <w:tcBorders>
               <w:top w:val="single" w:sz="4" w:space="0" w:color="BFC7D1"/>
               <w:left w:val="single" w:sz="4" w:space="0" w:color="BFC7D1"/>
@@ -7623,7 +7621,7 @@
         </w:tc>
         <w:tc>
           <w:tcPr>
-            <w:tcW w:w="2257" w:type="dxa"/>
+            <w:tcW w:w="2639" w:type="dxa"/>
             <w:tcBorders>
               <w:top w:val="single" w:sz="4" w:space="0" w:color="BFC7D1"/>
               <w:left w:val="single" w:sz="4" w:space="0" w:color="BFC7D1"/>
@@ -7662,7 +7660,7 @@
         </w:tc>
         <w:tc>
           <w:tcPr>
-            <w:tcW w:w="2256" w:type="dxa"/>
+            <w:tcW w:w="1361" w:type="dxa"/>
             <w:tcBorders>
               <w:top w:val="single" w:sz="4" w:space="0" w:color="BFC7D1"/>
               <w:left w:val="single" w:sz="4" w:space="0" w:color="BFC7D1"/>
@@ -7704,7 +7702,7 @@
         <w:trPr/>
         <w:tc>
           <w:tcPr>
-            <w:tcW w:w="2257" w:type="dxa"/>
+            <w:tcW w:w="2753" w:type="dxa"/>
             <w:tcBorders>
               <w:top w:val="single" w:sz="4" w:space="0" w:color="BFC7D1"/>
               <w:left w:val="single" w:sz="4" w:space="0" w:color="BFC7D1"/>
@@ -7741,7 +7739,7 @@
         </w:tc>
         <w:tc>
           <w:tcPr>
-            <w:tcW w:w="2257" w:type="dxa"/>
+            <w:tcW w:w="2261" w:type="dxa"/>
             <w:tcBorders>
               <w:top w:val="single" w:sz="4" w:space="0" w:color="BFC7D1"/>
               <w:left w:val="single" w:sz="4" w:space="0" w:color="BFC7D1"/>
@@ -7778,7 +7776,7 @@
         </w:tc>
         <w:tc>
           <w:tcPr>
-            <w:tcW w:w="2257" w:type="dxa"/>
+            <w:tcW w:w="2639" w:type="dxa"/>
             <w:tcBorders>
               <w:top w:val="single" w:sz="4" w:space="0" w:color="BFC7D1"/>
               <w:left w:val="single" w:sz="4" w:space="0" w:color="BFC7D1"/>
@@ -7815,7 +7813,7 @@
         </w:tc>
         <w:tc>
           <w:tcPr>
-            <w:tcW w:w="2256" w:type="dxa"/>
+            <w:tcW w:w="1361" w:type="dxa"/>
             <w:tcBorders>
               <w:top w:val="single" w:sz="4" w:space="0" w:color="BFC7D1"/>
               <w:left w:val="single" w:sz="4" w:space="0" w:color="BFC7D1"/>
@@ -7855,7 +7853,7 @@
         <w:trPr/>
         <w:tc>
           <w:tcPr>
-            <w:tcW w:w="2257" w:type="dxa"/>
+            <w:tcW w:w="2753" w:type="dxa"/>
             <w:tcBorders>
               <w:top w:val="single" w:sz="4" w:space="0" w:color="BFC7D1"/>
               <w:left w:val="single" w:sz="4" w:space="0" w:color="BFC7D1"/>
@@ -7892,7 +7890,7 @@
         </w:tc>
         <w:tc>
           <w:tcPr>
-            <w:tcW w:w="2257" w:type="dxa"/>
+            <w:tcW w:w="2261" w:type="dxa"/>
             <w:tcBorders>
               <w:top w:val="single" w:sz="4" w:space="0" w:color="BFC7D1"/>
               <w:left w:val="single" w:sz="4" w:space="0" w:color="BFC7D1"/>
@@ -7929,7 +7927,7 @@
         </w:tc>
         <w:tc>
           <w:tcPr>
-            <w:tcW w:w="2257" w:type="dxa"/>
+            <w:tcW w:w="2639" w:type="dxa"/>
             <w:tcBorders>
               <w:top w:val="single" w:sz="4" w:space="0" w:color="BFC7D1"/>
               <w:left w:val="single" w:sz="4" w:space="0" w:color="BFC7D1"/>
@@ -7966,7 +7964,7 @@
         </w:tc>
         <w:tc>
           <w:tcPr>
-            <w:tcW w:w="2256" w:type="dxa"/>
+            <w:tcW w:w="1361" w:type="dxa"/>
             <w:tcBorders>
               <w:top w:val="single" w:sz="4" w:space="0" w:color="BFC7D1"/>
               <w:left w:val="single" w:sz="4" w:space="0" w:color="BFC7D1"/>
@@ -8006,7 +8004,7 @@
         <w:trPr/>
         <w:tc>
           <w:tcPr>
-            <w:tcW w:w="2257" w:type="dxa"/>
+            <w:tcW w:w="2753" w:type="dxa"/>
             <w:tcBorders>
               <w:top w:val="single" w:sz="4" w:space="0" w:color="BFC7D1"/>
               <w:left w:val="single" w:sz="4" w:space="0" w:color="BFC7D1"/>
@@ -8043,7 +8041,7 @@
         </w:tc>
         <w:tc>
           <w:tcPr>
-            <w:tcW w:w="2257" w:type="dxa"/>
+            <w:tcW w:w="2261" w:type="dxa"/>
             <w:tcBorders>
               <w:top w:val="single" w:sz="4" w:space="0" w:color="BFC7D1"/>
               <w:left w:val="single" w:sz="4" w:space="0" w:color="BFC7D1"/>
@@ -8080,7 +8078,7 @@
         </w:tc>
         <w:tc>
           <w:tcPr>
-            <w:tcW w:w="2257" w:type="dxa"/>
+            <w:tcW w:w="2639" w:type="dxa"/>
             <w:tcBorders>
               <w:top w:val="single" w:sz="4" w:space="0" w:color="BFC7D1"/>
               <w:left w:val="single" w:sz="4" w:space="0" w:color="BFC7D1"/>
@@ -8117,7 +8115,7 @@
         </w:tc>
         <w:tc>
           <w:tcPr>
-            <w:tcW w:w="2256" w:type="dxa"/>
+            <w:tcW w:w="1361" w:type="dxa"/>
             <w:tcBorders>
               <w:top w:val="single" w:sz="4" w:space="0" w:color="BFC7D1"/>
               <w:left w:val="single" w:sz="4" w:space="0" w:color="BFC7D1"/>
@@ -8157,7 +8155,7 @@
         <w:trPr/>
         <w:tc>
           <w:tcPr>
-            <w:tcW w:w="2257" w:type="dxa"/>
+            <w:tcW w:w="2753" w:type="dxa"/>
             <w:tcBorders>
               <w:top w:val="single" w:sz="4" w:space="0" w:color="BFC7D1"/>
               <w:left w:val="single" w:sz="4" w:space="0" w:color="BFC7D1"/>
@@ -8194,7 +8192,7 @@
         </w:tc>
         <w:tc>
           <w:tcPr>
-            <w:tcW w:w="2257" w:type="dxa"/>
+            <w:tcW w:w="2261" w:type="dxa"/>
             <w:tcBorders>
               <w:top w:val="single" w:sz="4" w:space="0" w:color="BFC7D1"/>
               <w:left w:val="single" w:sz="4" w:space="0" w:color="BFC7D1"/>
@@ -8231,7 +8229,7 @@
         </w:tc>
         <w:tc>
           <w:tcPr>
-            <w:tcW w:w="2257" w:type="dxa"/>
+            <w:tcW w:w="2639" w:type="dxa"/>
             <w:tcBorders>
               <w:top w:val="single" w:sz="4" w:space="0" w:color="BFC7D1"/>
               <w:left w:val="single" w:sz="4" w:space="0" w:color="BFC7D1"/>
@@ -8268,7 +8266,7 @@
         </w:tc>
         <w:tc>
           <w:tcPr>
-            <w:tcW w:w="2256" w:type="dxa"/>
+            <w:tcW w:w="1361" w:type="dxa"/>
             <w:tcBorders>
               <w:top w:val="single" w:sz="4" w:space="0" w:color="BFC7D1"/>
               <w:left w:val="single" w:sz="4" w:space="0" w:color="BFC7D1"/>
@@ -8338,7 +8336,7 @@
         <w:pStyle w:val="Heading1"/>
         <w:rPr/>
       </w:pPr>
-      <w:bookmarkStart w:id="18" w:name="__RefHeading___Toc2459_2150771405"/>
+      <w:bookmarkStart w:id="18" w:name="__RefHeading___Toc5893_1649759004"/>
       <w:bookmarkEnd w:id="18"/>
       <w:r>
         <w:rPr>
@@ -8368,7 +8366,7 @@
     <w:tbl>
       <w:tblPr>
         <w:tblStyle w:val="TableGrid"/>
-        <w:tblW w:w="9027" w:type="dxa"/>
+        <w:tblW w:w="9013" w:type="dxa"/>
         <w:jc w:val="left"/>
         <w:tblInd w:w="0" w:type="dxa"/>
         <w:tblLayout w:type="fixed"/>
@@ -8381,9 +8379,9 @@
         <w:tblLook w:val="04a0" w:noHBand="0" w:noVBand="1" w:firstColumn="1" w:lastRow="0" w:lastColumn="0" w:firstRow="1"/>
       </w:tblPr>
       <w:tblGrid>
-        <w:gridCol w:w="3009"/>
-        <w:gridCol w:w="3009"/>
-        <w:gridCol w:w="3009"/>
+        <w:gridCol w:w="3671"/>
+        <w:gridCol w:w="3672"/>
+        <w:gridCol w:w="1670"/>
       </w:tblGrid>
       <w:tr>
         <w:trPr>
@@ -8391,7 +8389,7 @@
         </w:trPr>
         <w:tc>
           <w:tcPr>
-            <w:tcW w:w="3009" w:type="dxa"/>
+            <w:tcW w:w="3671" w:type="dxa"/>
             <w:tcBorders>
               <w:top w:val="single" w:sz="4" w:space="0" w:color="BFC7D1"/>
               <w:left w:val="single" w:sz="4" w:space="0" w:color="BFC7D1"/>
@@ -8430,7 +8428,7 @@
         </w:tc>
         <w:tc>
           <w:tcPr>
-            <w:tcW w:w="3009" w:type="dxa"/>
+            <w:tcW w:w="3672" w:type="dxa"/>
             <w:tcBorders>
               <w:top w:val="single" w:sz="4" w:space="0" w:color="BFC7D1"/>
               <w:left w:val="single" w:sz="4" w:space="0" w:color="BFC7D1"/>
@@ -8469,7 +8467,7 @@
         </w:tc>
         <w:tc>
           <w:tcPr>
-            <w:tcW w:w="3009" w:type="dxa"/>
+            <w:tcW w:w="1670" w:type="dxa"/>
             <w:tcBorders>
               <w:top w:val="single" w:sz="4" w:space="0" w:color="BFC7D1"/>
               <w:left w:val="single" w:sz="4" w:space="0" w:color="BFC7D1"/>
@@ -8511,7 +8509,7 @@
         <w:trPr/>
         <w:tc>
           <w:tcPr>
-            <w:tcW w:w="3009" w:type="dxa"/>
+            <w:tcW w:w="3671" w:type="dxa"/>
             <w:tcBorders>
               <w:top w:val="single" w:sz="4" w:space="0" w:color="BFC7D1"/>
               <w:left w:val="single" w:sz="4" w:space="0" w:color="BFC7D1"/>
@@ -8548,7 +8546,7 @@
         </w:tc>
         <w:tc>
           <w:tcPr>
-            <w:tcW w:w="3009" w:type="dxa"/>
+            <w:tcW w:w="3672" w:type="dxa"/>
             <w:tcBorders>
               <w:top w:val="single" w:sz="4" w:space="0" w:color="BFC7D1"/>
               <w:left w:val="single" w:sz="4" w:space="0" w:color="BFC7D1"/>
@@ -8585,7 +8583,7 @@
         </w:tc>
         <w:tc>
           <w:tcPr>
-            <w:tcW w:w="3009" w:type="dxa"/>
+            <w:tcW w:w="1670" w:type="dxa"/>
             <w:tcBorders>
               <w:top w:val="single" w:sz="4" w:space="0" w:color="BFC7D1"/>
               <w:left w:val="single" w:sz="4" w:space="0" w:color="BFC7D1"/>
@@ -8625,7 +8623,7 @@
         <w:trPr/>
         <w:tc>
           <w:tcPr>
-            <w:tcW w:w="3009" w:type="dxa"/>
+            <w:tcW w:w="3671" w:type="dxa"/>
             <w:tcBorders>
               <w:top w:val="single" w:sz="4" w:space="0" w:color="BFC7D1"/>
               <w:left w:val="single" w:sz="4" w:space="0" w:color="BFC7D1"/>
@@ -8662,7 +8660,7 @@
         </w:tc>
         <w:tc>
           <w:tcPr>
-            <w:tcW w:w="3009" w:type="dxa"/>
+            <w:tcW w:w="3672" w:type="dxa"/>
             <w:tcBorders>
               <w:top w:val="single" w:sz="4" w:space="0" w:color="BFC7D1"/>
               <w:left w:val="single" w:sz="4" w:space="0" w:color="BFC7D1"/>
@@ -8699,7 +8697,7 @@
         </w:tc>
         <w:tc>
           <w:tcPr>
-            <w:tcW w:w="3009" w:type="dxa"/>
+            <w:tcW w:w="1670" w:type="dxa"/>
             <w:tcBorders>
               <w:top w:val="single" w:sz="4" w:space="0" w:color="BFC7D1"/>
               <w:left w:val="single" w:sz="4" w:space="0" w:color="BFC7D1"/>
@@ -8739,7 +8737,7 @@
         <w:trPr/>
         <w:tc>
           <w:tcPr>
-            <w:tcW w:w="3009" w:type="dxa"/>
+            <w:tcW w:w="3671" w:type="dxa"/>
             <w:tcBorders>
               <w:top w:val="single" w:sz="4" w:space="0" w:color="BFC7D1"/>
               <w:left w:val="single" w:sz="4" w:space="0" w:color="BFC7D1"/>
@@ -8776,7 +8774,7 @@
         </w:tc>
         <w:tc>
           <w:tcPr>
-            <w:tcW w:w="3009" w:type="dxa"/>
+            <w:tcW w:w="3672" w:type="dxa"/>
             <w:tcBorders>
               <w:top w:val="single" w:sz="4" w:space="0" w:color="BFC7D1"/>
               <w:left w:val="single" w:sz="4" w:space="0" w:color="BFC7D1"/>
@@ -8813,7 +8811,7 @@
         </w:tc>
         <w:tc>
           <w:tcPr>
-            <w:tcW w:w="3009" w:type="dxa"/>
+            <w:tcW w:w="1670" w:type="dxa"/>
             <w:tcBorders>
               <w:top w:val="single" w:sz="4" w:space="0" w:color="BFC7D1"/>
               <w:left w:val="single" w:sz="4" w:space="0" w:color="BFC7D1"/>
@@ -8853,7 +8851,7 @@
         <w:trPr/>
         <w:tc>
           <w:tcPr>
-            <w:tcW w:w="3009" w:type="dxa"/>
+            <w:tcW w:w="3671" w:type="dxa"/>
             <w:tcBorders>
               <w:top w:val="single" w:sz="4" w:space="0" w:color="BFC7D1"/>
               <w:left w:val="single" w:sz="4" w:space="0" w:color="BFC7D1"/>
@@ -8890,7 +8888,7 @@
         </w:tc>
         <w:tc>
           <w:tcPr>
-            <w:tcW w:w="3009" w:type="dxa"/>
+            <w:tcW w:w="3672" w:type="dxa"/>
             <w:tcBorders>
               <w:top w:val="single" w:sz="4" w:space="0" w:color="BFC7D1"/>
               <w:left w:val="single" w:sz="4" w:space="0" w:color="BFC7D1"/>
@@ -8927,7 +8925,7 @@
         </w:tc>
         <w:tc>
           <w:tcPr>
-            <w:tcW w:w="3009" w:type="dxa"/>
+            <w:tcW w:w="1670" w:type="dxa"/>
             <w:tcBorders>
               <w:top w:val="single" w:sz="4" w:space="0" w:color="BFC7D1"/>
               <w:left w:val="single" w:sz="4" w:space="0" w:color="BFC7D1"/>
@@ -8967,7 +8965,7 @@
         <w:trPr/>
         <w:tc>
           <w:tcPr>
-            <w:tcW w:w="3009" w:type="dxa"/>
+            <w:tcW w:w="3671" w:type="dxa"/>
             <w:tcBorders>
               <w:top w:val="single" w:sz="4" w:space="0" w:color="BFC7D1"/>
               <w:left w:val="single" w:sz="4" w:space="0" w:color="BFC7D1"/>
@@ -9004,7 +9002,7 @@
         </w:tc>
         <w:tc>
           <w:tcPr>
-            <w:tcW w:w="3009" w:type="dxa"/>
+            <w:tcW w:w="3672" w:type="dxa"/>
             <w:tcBorders>
               <w:top w:val="single" w:sz="4" w:space="0" w:color="BFC7D1"/>
               <w:left w:val="single" w:sz="4" w:space="0" w:color="BFC7D1"/>
@@ -9041,7 +9039,7 @@
         </w:tc>
         <w:tc>
           <w:tcPr>
-            <w:tcW w:w="3009" w:type="dxa"/>
+            <w:tcW w:w="1670" w:type="dxa"/>
             <w:tcBorders>
               <w:top w:val="single" w:sz="4" w:space="0" w:color="BFC7D1"/>
               <w:left w:val="single" w:sz="4" w:space="0" w:color="BFC7D1"/>
@@ -9081,7 +9079,7 @@
         <w:trPr/>
         <w:tc>
           <w:tcPr>
-            <w:tcW w:w="3009" w:type="dxa"/>
+            <w:tcW w:w="3671" w:type="dxa"/>
             <w:tcBorders>
               <w:top w:val="single" w:sz="4" w:space="0" w:color="BFC7D1"/>
               <w:left w:val="single" w:sz="4" w:space="0" w:color="BFC7D1"/>
@@ -9118,7 +9116,7 @@
         </w:tc>
         <w:tc>
           <w:tcPr>
-            <w:tcW w:w="3009" w:type="dxa"/>
+            <w:tcW w:w="3672" w:type="dxa"/>
             <w:tcBorders>
               <w:top w:val="single" w:sz="4" w:space="0" w:color="BFC7D1"/>
               <w:left w:val="single" w:sz="4" w:space="0" w:color="BFC7D1"/>
@@ -9155,7 +9153,7 @@
         </w:tc>
         <w:tc>
           <w:tcPr>
-            <w:tcW w:w="3009" w:type="dxa"/>
+            <w:tcW w:w="1670" w:type="dxa"/>
             <w:tcBorders>
               <w:top w:val="single" w:sz="4" w:space="0" w:color="BFC7D1"/>
               <w:left w:val="single" w:sz="4" w:space="0" w:color="BFC7D1"/>
@@ -9195,7 +9193,7 @@
         <w:trPr/>
         <w:tc>
           <w:tcPr>
-            <w:tcW w:w="3009" w:type="dxa"/>
+            <w:tcW w:w="3671" w:type="dxa"/>
             <w:tcBorders>
               <w:top w:val="single" w:sz="4" w:space="0" w:color="BFC7D1"/>
               <w:left w:val="single" w:sz="4" w:space="0" w:color="BFC7D1"/>
@@ -9232,7 +9230,7 @@
         </w:tc>
         <w:tc>
           <w:tcPr>
-            <w:tcW w:w="3009" w:type="dxa"/>
+            <w:tcW w:w="3672" w:type="dxa"/>
             <w:tcBorders>
               <w:top w:val="single" w:sz="4" w:space="0" w:color="BFC7D1"/>
               <w:left w:val="single" w:sz="4" w:space="0" w:color="BFC7D1"/>
@@ -9269,7 +9267,7 @@
         </w:tc>
         <w:tc>
           <w:tcPr>
-            <w:tcW w:w="3009" w:type="dxa"/>
+            <w:tcW w:w="1670" w:type="dxa"/>
             <w:tcBorders>
               <w:top w:val="single" w:sz="4" w:space="0" w:color="BFC7D1"/>
               <w:left w:val="single" w:sz="4" w:space="0" w:color="BFC7D1"/>
@@ -9309,7 +9307,7 @@
         <w:trPr/>
         <w:tc>
           <w:tcPr>
-            <w:tcW w:w="3009" w:type="dxa"/>
+            <w:tcW w:w="3671" w:type="dxa"/>
             <w:tcBorders>
               <w:top w:val="single" w:sz="4" w:space="0" w:color="BFC7D1"/>
               <w:left w:val="single" w:sz="4" w:space="0" w:color="BFC7D1"/>
@@ -9346,7 +9344,7 @@
         </w:tc>
         <w:tc>
           <w:tcPr>
-            <w:tcW w:w="3009" w:type="dxa"/>
+            <w:tcW w:w="3672" w:type="dxa"/>
             <w:tcBorders>
               <w:top w:val="single" w:sz="4" w:space="0" w:color="BFC7D1"/>
               <w:left w:val="single" w:sz="4" w:space="0" w:color="BFC7D1"/>
@@ -9383,7 +9381,7 @@
         </w:tc>
         <w:tc>
           <w:tcPr>
-            <w:tcW w:w="3009" w:type="dxa"/>
+            <w:tcW w:w="1670" w:type="dxa"/>
             <w:tcBorders>
               <w:top w:val="single" w:sz="4" w:space="0" w:color="BFC7D1"/>
               <w:left w:val="single" w:sz="4" w:space="0" w:color="BFC7D1"/>
@@ -9525,7 +9523,7 @@
         <w:pStyle w:val="Heading1"/>
         <w:rPr/>
       </w:pPr>
-      <w:bookmarkStart w:id="19" w:name="__RefHeading___Toc2461_2150771405"/>
+      <w:bookmarkStart w:id="19" w:name="__RefHeading___Toc5895_1649759004"/>
       <w:bookmarkEnd w:id="19"/>
       <w:r>
         <w:rPr>
@@ -9555,7 +9553,7 @@
     <w:tbl>
       <w:tblPr>
         <w:tblStyle w:val="TableGrid"/>
-        <w:tblW w:w="9028" w:type="dxa"/>
+        <w:tblW w:w="9014" w:type="dxa"/>
         <w:jc w:val="left"/>
         <w:tblInd w:w="0" w:type="dxa"/>
         <w:tblLayout w:type="fixed"/>
@@ -9568,10 +9566,10 @@
         <w:tblLook w:val="04a0" w:noHBand="0" w:noVBand="1" w:firstColumn="1" w:lastRow="0" w:lastColumn="0" w:firstRow="1"/>
       </w:tblPr>
       <w:tblGrid>
-        <w:gridCol w:w="2257"/>
-        <w:gridCol w:w="2257"/>
-        <w:gridCol w:w="2257"/>
-        <w:gridCol w:w="2256"/>
+        <w:gridCol w:w="1407"/>
+        <w:gridCol w:w="1973"/>
+        <w:gridCol w:w="2253"/>
+        <w:gridCol w:w="3380"/>
       </w:tblGrid>
       <w:tr>
         <w:trPr>
@@ -9579,7 +9577,7 @@
         </w:trPr>
         <w:tc>
           <w:tcPr>
-            <w:tcW w:w="2257" w:type="dxa"/>
+            <w:tcW w:w="1407" w:type="dxa"/>
             <w:tcBorders>
               <w:top w:val="single" w:sz="4" w:space="0" w:color="BFC7D1"/>
               <w:left w:val="single" w:sz="4" w:space="0" w:color="BFC7D1"/>
@@ -9618,7 +9616,7 @@
         </w:tc>
         <w:tc>
           <w:tcPr>
-            <w:tcW w:w="2257" w:type="dxa"/>
+            <w:tcW w:w="1973" w:type="dxa"/>
             <w:tcBorders>
               <w:top w:val="single" w:sz="4" w:space="0" w:color="BFC7D1"/>
               <w:left w:val="single" w:sz="4" w:space="0" w:color="BFC7D1"/>
@@ -9657,7 +9655,7 @@
         </w:tc>
         <w:tc>
           <w:tcPr>
-            <w:tcW w:w="2257" w:type="dxa"/>
+            <w:tcW w:w="2253" w:type="dxa"/>
             <w:tcBorders>
               <w:top w:val="single" w:sz="4" w:space="0" w:color="BFC7D1"/>
               <w:left w:val="single" w:sz="4" w:space="0" w:color="BFC7D1"/>
@@ -9696,7 +9694,7 @@
         </w:tc>
         <w:tc>
           <w:tcPr>
-            <w:tcW w:w="2256" w:type="dxa"/>
+            <w:tcW w:w="3380" w:type="dxa"/>
             <w:tcBorders>
               <w:top w:val="single" w:sz="4" w:space="0" w:color="BFC7D1"/>
               <w:left w:val="single" w:sz="4" w:space="0" w:color="BFC7D1"/>
@@ -9738,7 +9736,7 @@
         <w:trPr/>
         <w:tc>
           <w:tcPr>
-            <w:tcW w:w="2257" w:type="dxa"/>
+            <w:tcW w:w="1407" w:type="dxa"/>
             <w:tcBorders>
               <w:top w:val="single" w:sz="4" w:space="0" w:color="BFC7D1"/>
               <w:left w:val="single" w:sz="4" w:space="0" w:color="BFC7D1"/>
@@ -9775,7 +9773,7 @@
         </w:tc>
         <w:tc>
           <w:tcPr>
-            <w:tcW w:w="2257" w:type="dxa"/>
+            <w:tcW w:w="1973" w:type="dxa"/>
             <w:tcBorders>
               <w:top w:val="single" w:sz="4" w:space="0" w:color="BFC7D1"/>
               <w:left w:val="single" w:sz="4" w:space="0" w:color="BFC7D1"/>
@@ -9812,7 +9810,7 @@
         </w:tc>
         <w:tc>
           <w:tcPr>
-            <w:tcW w:w="2257" w:type="dxa"/>
+            <w:tcW w:w="2253" w:type="dxa"/>
             <w:tcBorders>
               <w:top w:val="single" w:sz="4" w:space="0" w:color="BFC7D1"/>
               <w:left w:val="single" w:sz="4" w:space="0" w:color="BFC7D1"/>
@@ -9849,7 +9847,7 @@
         </w:tc>
         <w:tc>
           <w:tcPr>
-            <w:tcW w:w="2256" w:type="dxa"/>
+            <w:tcW w:w="3380" w:type="dxa"/>
             <w:tcBorders>
               <w:top w:val="single" w:sz="4" w:space="0" w:color="BFC7D1"/>
               <w:left w:val="single" w:sz="4" w:space="0" w:color="BFC7D1"/>
@@ -9889,7 +9887,7 @@
         <w:trPr/>
         <w:tc>
           <w:tcPr>
-            <w:tcW w:w="2257" w:type="dxa"/>
+            <w:tcW w:w="1407" w:type="dxa"/>
             <w:tcBorders>
               <w:top w:val="single" w:sz="4" w:space="0" w:color="BFC7D1"/>
               <w:left w:val="single" w:sz="4" w:space="0" w:color="BFC7D1"/>
@@ -9926,7 +9924,7 @@
         </w:tc>
         <w:tc>
           <w:tcPr>
-            <w:tcW w:w="2257" w:type="dxa"/>
+            <w:tcW w:w="1973" w:type="dxa"/>
             <w:tcBorders>
               <w:top w:val="single" w:sz="4" w:space="0" w:color="BFC7D1"/>
               <w:left w:val="single" w:sz="4" w:space="0" w:color="BFC7D1"/>
@@ -9963,7 +9961,7 @@
         </w:tc>
         <w:tc>
           <w:tcPr>
-            <w:tcW w:w="2257" w:type="dxa"/>
+            <w:tcW w:w="2253" w:type="dxa"/>
             <w:tcBorders>
               <w:top w:val="single" w:sz="4" w:space="0" w:color="BFC7D1"/>
               <w:left w:val="single" w:sz="4" w:space="0" w:color="BFC7D1"/>
@@ -10000,7 +9998,7 @@
         </w:tc>
         <w:tc>
           <w:tcPr>
-            <w:tcW w:w="2256" w:type="dxa"/>
+            <w:tcW w:w="3380" w:type="dxa"/>
             <w:tcBorders>
               <w:top w:val="single" w:sz="4" w:space="0" w:color="BFC7D1"/>
               <w:left w:val="single" w:sz="4" w:space="0" w:color="BFC7D1"/>
@@ -10040,7 +10038,7 @@
         <w:trPr/>
         <w:tc>
           <w:tcPr>
-            <w:tcW w:w="2257" w:type="dxa"/>
+            <w:tcW w:w="1407" w:type="dxa"/>
             <w:tcBorders>
               <w:top w:val="single" w:sz="4" w:space="0" w:color="BFC7D1"/>
               <w:left w:val="single" w:sz="4" w:space="0" w:color="BFC7D1"/>
@@ -10077,7 +10075,7 @@
         </w:tc>
         <w:tc>
           <w:tcPr>
-            <w:tcW w:w="2257" w:type="dxa"/>
+            <w:tcW w:w="1973" w:type="dxa"/>
             <w:tcBorders>
               <w:top w:val="single" w:sz="4" w:space="0" w:color="BFC7D1"/>
               <w:left w:val="single" w:sz="4" w:space="0" w:color="BFC7D1"/>
@@ -10114,7 +10112,7 @@
         </w:tc>
         <w:tc>
           <w:tcPr>
-            <w:tcW w:w="2257" w:type="dxa"/>
+            <w:tcW w:w="2253" w:type="dxa"/>
             <w:tcBorders>
               <w:top w:val="single" w:sz="4" w:space="0" w:color="BFC7D1"/>
               <w:left w:val="single" w:sz="4" w:space="0" w:color="BFC7D1"/>
@@ -10151,7 +10149,7 @@
         </w:tc>
         <w:tc>
           <w:tcPr>
-            <w:tcW w:w="2256" w:type="dxa"/>
+            <w:tcW w:w="3380" w:type="dxa"/>
             <w:tcBorders>
               <w:top w:val="single" w:sz="4" w:space="0" w:color="BFC7D1"/>
               <w:left w:val="single" w:sz="4" w:space="0" w:color="BFC7D1"/>
@@ -10191,7 +10189,7 @@
         <w:trPr/>
         <w:tc>
           <w:tcPr>
-            <w:tcW w:w="2257" w:type="dxa"/>
+            <w:tcW w:w="1407" w:type="dxa"/>
             <w:tcBorders>
               <w:top w:val="single" w:sz="4" w:space="0" w:color="BFC7D1"/>
               <w:left w:val="single" w:sz="4" w:space="0" w:color="BFC7D1"/>
@@ -10228,7 +10226,7 @@
         </w:tc>
         <w:tc>
           <w:tcPr>
-            <w:tcW w:w="2257" w:type="dxa"/>
+            <w:tcW w:w="1973" w:type="dxa"/>
             <w:tcBorders>
               <w:top w:val="single" w:sz="4" w:space="0" w:color="BFC7D1"/>
               <w:left w:val="single" w:sz="4" w:space="0" w:color="BFC7D1"/>
@@ -10265,7 +10263,7 @@
         </w:tc>
         <w:tc>
           <w:tcPr>
-            <w:tcW w:w="2257" w:type="dxa"/>
+            <w:tcW w:w="2253" w:type="dxa"/>
             <w:tcBorders>
               <w:top w:val="single" w:sz="4" w:space="0" w:color="BFC7D1"/>
               <w:left w:val="single" w:sz="4" w:space="0" w:color="BFC7D1"/>
@@ -10302,7 +10300,7 @@
         </w:tc>
         <w:tc>
           <w:tcPr>
-            <w:tcW w:w="2256" w:type="dxa"/>
+            <w:tcW w:w="3380" w:type="dxa"/>
             <w:tcBorders>
               <w:top w:val="single" w:sz="4" w:space="0" w:color="BFC7D1"/>
               <w:left w:val="single" w:sz="4" w:space="0" w:color="BFC7D1"/>
@@ -10414,7 +10412,7 @@
         <w:pStyle w:val="Heading1"/>
         <w:rPr/>
       </w:pPr>
-      <w:bookmarkStart w:id="20" w:name="__RefHeading___Toc2463_2150771405"/>
+      <w:bookmarkStart w:id="20" w:name="__RefHeading___Toc5897_1649759004"/>
       <w:bookmarkEnd w:id="20"/>
       <w:r>
         <w:rPr>
@@ -10431,7 +10429,7 @@
         <w:pStyle w:val="Heading2"/>
         <w:rPr/>
       </w:pPr>
-      <w:bookmarkStart w:id="21" w:name="__RefHeading___Toc2465_2150771405"/>
+      <w:bookmarkStart w:id="21" w:name="__RefHeading___Toc5899_1649759004"/>
       <w:bookmarkEnd w:id="21"/>
       <w:r>
         <w:rPr>
@@ -10446,7 +10444,7 @@
     <w:tbl>
       <w:tblPr>
         <w:tblStyle w:val="TableGrid"/>
-        <w:tblW w:w="9027" w:type="dxa"/>
+        <w:tblW w:w="9014" w:type="dxa"/>
         <w:jc w:val="left"/>
         <w:tblInd w:w="0" w:type="dxa"/>
         <w:tblLayout w:type="fixed"/>
@@ -10459,9 +10457,9 @@
         <w:tblLook w:val="04a0" w:noHBand="0" w:noVBand="1" w:firstColumn="1" w:lastRow="0" w:lastColumn="0" w:firstRow="1"/>
       </w:tblPr>
       <w:tblGrid>
-        <w:gridCol w:w="3009"/>
-        <w:gridCol w:w="3009"/>
-        <w:gridCol w:w="3009"/>
+        <w:gridCol w:w="4673"/>
+        <w:gridCol w:w="2171"/>
+        <w:gridCol w:w="2170"/>
       </w:tblGrid>
       <w:tr>
         <w:trPr>
@@ -10469,7 +10467,7 @@
         </w:trPr>
         <w:tc>
           <w:tcPr>
-            <w:tcW w:w="3009" w:type="dxa"/>
+            <w:tcW w:w="4673" w:type="dxa"/>
             <w:tcBorders>
               <w:top w:val="single" w:sz="4" w:space="0" w:color="BFC7D1"/>
               <w:left w:val="single" w:sz="4" w:space="0" w:color="BFC7D1"/>
@@ -10508,7 +10506,7 @@
         </w:tc>
         <w:tc>
           <w:tcPr>
-            <w:tcW w:w="3009" w:type="dxa"/>
+            <w:tcW w:w="2171" w:type="dxa"/>
             <w:tcBorders>
               <w:top w:val="single" w:sz="4" w:space="0" w:color="BFC7D1"/>
               <w:left w:val="single" w:sz="4" w:space="0" w:color="BFC7D1"/>
@@ -10547,7 +10545,7 @@
         </w:tc>
         <w:tc>
           <w:tcPr>
-            <w:tcW w:w="3009" w:type="dxa"/>
+            <w:tcW w:w="2170" w:type="dxa"/>
             <w:tcBorders>
               <w:top w:val="single" w:sz="4" w:space="0" w:color="BFC7D1"/>
               <w:left w:val="single" w:sz="4" w:space="0" w:color="BFC7D1"/>
@@ -10589,7 +10587,7 @@
         <w:trPr/>
         <w:tc>
           <w:tcPr>
-            <w:tcW w:w="3009" w:type="dxa"/>
+            <w:tcW w:w="4673" w:type="dxa"/>
             <w:tcBorders>
               <w:top w:val="single" w:sz="4" w:space="0" w:color="BFC7D1"/>
               <w:left w:val="single" w:sz="4" w:space="0" w:color="BFC7D1"/>
@@ -10626,7 +10624,7 @@
         </w:tc>
         <w:tc>
           <w:tcPr>
-            <w:tcW w:w="3009" w:type="dxa"/>
+            <w:tcW w:w="2171" w:type="dxa"/>
             <w:tcBorders>
               <w:top w:val="single" w:sz="4" w:space="0" w:color="BFC7D1"/>
               <w:left w:val="single" w:sz="4" w:space="0" w:color="BFC7D1"/>
@@ -10663,7 +10661,7 @@
         </w:tc>
         <w:tc>
           <w:tcPr>
-            <w:tcW w:w="3009" w:type="dxa"/>
+            <w:tcW w:w="2170" w:type="dxa"/>
             <w:tcBorders>
               <w:top w:val="single" w:sz="4" w:space="0" w:color="BFC7D1"/>
               <w:left w:val="single" w:sz="4" w:space="0" w:color="BFC7D1"/>
@@ -10703,7 +10701,7 @@
         <w:trPr/>
         <w:tc>
           <w:tcPr>
-            <w:tcW w:w="3009" w:type="dxa"/>
+            <w:tcW w:w="4673" w:type="dxa"/>
             <w:tcBorders>
               <w:top w:val="single" w:sz="4" w:space="0" w:color="BFC7D1"/>
               <w:left w:val="single" w:sz="4" w:space="0" w:color="BFC7D1"/>
@@ -10740,7 +10738,7 @@
         </w:tc>
         <w:tc>
           <w:tcPr>
-            <w:tcW w:w="3009" w:type="dxa"/>
+            <w:tcW w:w="2171" w:type="dxa"/>
             <w:tcBorders>
               <w:top w:val="single" w:sz="4" w:space="0" w:color="BFC7D1"/>
               <w:left w:val="single" w:sz="4" w:space="0" w:color="BFC7D1"/>
@@ -10777,7 +10775,7 @@
         </w:tc>
         <w:tc>
           <w:tcPr>
-            <w:tcW w:w="3009" w:type="dxa"/>
+            <w:tcW w:w="2170" w:type="dxa"/>
             <w:tcBorders>
               <w:top w:val="single" w:sz="4" w:space="0" w:color="BFC7D1"/>
               <w:left w:val="single" w:sz="4" w:space="0" w:color="BFC7D1"/>
@@ -10817,7 +10815,7 @@
         <w:trPr/>
         <w:tc>
           <w:tcPr>
-            <w:tcW w:w="3009" w:type="dxa"/>
+            <w:tcW w:w="4673" w:type="dxa"/>
             <w:tcBorders>
               <w:top w:val="single" w:sz="4" w:space="0" w:color="BFC7D1"/>
               <w:left w:val="single" w:sz="4" w:space="0" w:color="BFC7D1"/>
@@ -10854,7 +10852,7 @@
         </w:tc>
         <w:tc>
           <w:tcPr>
-            <w:tcW w:w="3009" w:type="dxa"/>
+            <w:tcW w:w="2171" w:type="dxa"/>
             <w:tcBorders>
               <w:top w:val="single" w:sz="4" w:space="0" w:color="BFC7D1"/>
               <w:left w:val="single" w:sz="4" w:space="0" w:color="BFC7D1"/>
@@ -10891,7 +10889,7 @@
         </w:tc>
         <w:tc>
           <w:tcPr>
-            <w:tcW w:w="3009" w:type="dxa"/>
+            <w:tcW w:w="2170" w:type="dxa"/>
             <w:tcBorders>
               <w:top w:val="single" w:sz="4" w:space="0" w:color="BFC7D1"/>
               <w:left w:val="single" w:sz="4" w:space="0" w:color="BFC7D1"/>
@@ -10931,7 +10929,7 @@
         <w:trPr/>
         <w:tc>
           <w:tcPr>
-            <w:tcW w:w="3009" w:type="dxa"/>
+            <w:tcW w:w="4673" w:type="dxa"/>
             <w:tcBorders>
               <w:top w:val="single" w:sz="4" w:space="0" w:color="BFC7D1"/>
               <w:left w:val="single" w:sz="4" w:space="0" w:color="BFC7D1"/>
@@ -10968,7 +10966,7 @@
         </w:tc>
         <w:tc>
           <w:tcPr>
-            <w:tcW w:w="3009" w:type="dxa"/>
+            <w:tcW w:w="2171" w:type="dxa"/>
             <w:tcBorders>
               <w:top w:val="single" w:sz="4" w:space="0" w:color="BFC7D1"/>
               <w:left w:val="single" w:sz="4" w:space="0" w:color="BFC7D1"/>
@@ -11005,7 +11003,7 @@
         </w:tc>
         <w:tc>
           <w:tcPr>
-            <w:tcW w:w="3009" w:type="dxa"/>
+            <w:tcW w:w="2170" w:type="dxa"/>
             <w:tcBorders>
               <w:top w:val="single" w:sz="4" w:space="0" w:color="BFC7D1"/>
               <w:left w:val="single" w:sz="4" w:space="0" w:color="BFC7D1"/>
@@ -11045,7 +11043,7 @@
         <w:trPr/>
         <w:tc>
           <w:tcPr>
-            <w:tcW w:w="3009" w:type="dxa"/>
+            <w:tcW w:w="4673" w:type="dxa"/>
             <w:tcBorders>
               <w:top w:val="single" w:sz="4" w:space="0" w:color="BFC7D1"/>
               <w:left w:val="single" w:sz="4" w:space="0" w:color="BFC7D1"/>
@@ -11082,7 +11080,7 @@
         </w:tc>
         <w:tc>
           <w:tcPr>
-            <w:tcW w:w="3009" w:type="dxa"/>
+            <w:tcW w:w="2171" w:type="dxa"/>
             <w:tcBorders>
               <w:top w:val="single" w:sz="4" w:space="0" w:color="BFC7D1"/>
               <w:left w:val="single" w:sz="4" w:space="0" w:color="BFC7D1"/>
@@ -11119,7 +11117,7 @@
         </w:tc>
         <w:tc>
           <w:tcPr>
-            <w:tcW w:w="3009" w:type="dxa"/>
+            <w:tcW w:w="2170" w:type="dxa"/>
             <w:tcBorders>
               <w:top w:val="single" w:sz="4" w:space="0" w:color="BFC7D1"/>
               <w:left w:val="single" w:sz="4" w:space="0" w:color="BFC7D1"/>
@@ -11186,7 +11184,7 @@
         <w:pStyle w:val="Heading2"/>
         <w:rPr/>
       </w:pPr>
-      <w:bookmarkStart w:id="22" w:name="__RefHeading___Toc2467_2150771405"/>
+      <w:bookmarkStart w:id="22" w:name="__RefHeading___Toc5901_1649759004"/>
       <w:bookmarkEnd w:id="22"/>
       <w:r>
         <w:rPr>
@@ -11277,7 +11275,7 @@
     <w:tbl>
       <w:tblPr>
         <w:tblStyle w:val="TableGrid"/>
-        <w:tblW w:w="9028" w:type="dxa"/>
+        <w:tblW w:w="9014" w:type="dxa"/>
         <w:jc w:val="left"/>
         <w:tblInd w:w="0" w:type="dxa"/>
         <w:tblLayout w:type="fixed"/>
@@ -11290,10 +11288,10 @@
         <w:tblLook w:val="04a0" w:noHBand="0" w:noVBand="1" w:firstColumn="1" w:lastRow="0" w:lastColumn="0" w:firstRow="1"/>
       </w:tblPr>
       <w:tblGrid>
-        <w:gridCol w:w="2257"/>
-        <w:gridCol w:w="2257"/>
-        <w:gridCol w:w="2257"/>
-        <w:gridCol w:w="2256"/>
+        <w:gridCol w:w="906"/>
+        <w:gridCol w:w="1811"/>
+        <w:gridCol w:w="4485"/>
+        <w:gridCol w:w="1811"/>
       </w:tblGrid>
       <w:tr>
         <w:trPr>
@@ -11301,7 +11299,7 @@
         </w:trPr>
         <w:tc>
           <w:tcPr>
-            <w:tcW w:w="2257" w:type="dxa"/>
+            <w:tcW w:w="906" w:type="dxa"/>
             <w:tcBorders>
               <w:top w:val="single" w:sz="4" w:space="0" w:color="BFC7D1"/>
               <w:left w:val="single" w:sz="4" w:space="0" w:color="BFC7D1"/>
@@ -11340,7 +11338,7 @@
         </w:tc>
         <w:tc>
           <w:tcPr>
-            <w:tcW w:w="2257" w:type="dxa"/>
+            <w:tcW w:w="1811" w:type="dxa"/>
             <w:tcBorders>
               <w:top w:val="single" w:sz="4" w:space="0" w:color="BFC7D1"/>
               <w:left w:val="single" w:sz="4" w:space="0" w:color="BFC7D1"/>
@@ -11379,7 +11377,7 @@
         </w:tc>
         <w:tc>
           <w:tcPr>
-            <w:tcW w:w="2257" w:type="dxa"/>
+            <w:tcW w:w="4485" w:type="dxa"/>
             <w:tcBorders>
               <w:top w:val="single" w:sz="4" w:space="0" w:color="BFC7D1"/>
               <w:left w:val="single" w:sz="4" w:space="0" w:color="BFC7D1"/>
@@ -11418,7 +11416,7 @@
         </w:tc>
         <w:tc>
           <w:tcPr>
-            <w:tcW w:w="2256" w:type="dxa"/>
+            <w:tcW w:w="1811" w:type="dxa"/>
             <w:tcBorders>
               <w:top w:val="single" w:sz="4" w:space="0" w:color="BFC7D1"/>
               <w:left w:val="single" w:sz="4" w:space="0" w:color="BFC7D1"/>
@@ -11460,7 +11458,7 @@
         <w:trPr/>
         <w:tc>
           <w:tcPr>
-            <w:tcW w:w="2257" w:type="dxa"/>
+            <w:tcW w:w="906" w:type="dxa"/>
             <w:tcBorders>
               <w:top w:val="single" w:sz="4" w:space="0" w:color="BFC7D1"/>
               <w:left w:val="single" w:sz="4" w:space="0" w:color="BFC7D1"/>
@@ -11497,7 +11495,7 @@
         </w:tc>
         <w:tc>
           <w:tcPr>
-            <w:tcW w:w="2257" w:type="dxa"/>
+            <w:tcW w:w="1811" w:type="dxa"/>
             <w:tcBorders>
               <w:top w:val="single" w:sz="4" w:space="0" w:color="BFC7D1"/>
               <w:left w:val="single" w:sz="4" w:space="0" w:color="BFC7D1"/>
@@ -11534,7 +11532,7 @@
         </w:tc>
         <w:tc>
           <w:tcPr>
-            <w:tcW w:w="2257" w:type="dxa"/>
+            <w:tcW w:w="4485" w:type="dxa"/>
             <w:tcBorders>
               <w:top w:val="single" w:sz="4" w:space="0" w:color="BFC7D1"/>
               <w:left w:val="single" w:sz="4" w:space="0" w:color="BFC7D1"/>
@@ -11571,7 +11569,7 @@
         </w:tc>
         <w:tc>
           <w:tcPr>
-            <w:tcW w:w="2256" w:type="dxa"/>
+            <w:tcW w:w="1811" w:type="dxa"/>
             <w:tcBorders>
               <w:top w:val="single" w:sz="4" w:space="0" w:color="BFC7D1"/>
               <w:left w:val="single" w:sz="4" w:space="0" w:color="BFC7D1"/>
@@ -11611,7 +11609,7 @@
         <w:trPr/>
         <w:tc>
           <w:tcPr>
-            <w:tcW w:w="2257" w:type="dxa"/>
+            <w:tcW w:w="906" w:type="dxa"/>
             <w:tcBorders>
               <w:top w:val="single" w:sz="4" w:space="0" w:color="BFC7D1"/>
               <w:left w:val="single" w:sz="4" w:space="0" w:color="BFC7D1"/>
@@ -11648,7 +11646,7 @@
         </w:tc>
         <w:tc>
           <w:tcPr>
-            <w:tcW w:w="2257" w:type="dxa"/>
+            <w:tcW w:w="1811" w:type="dxa"/>
             <w:tcBorders>
               <w:top w:val="single" w:sz="4" w:space="0" w:color="BFC7D1"/>
               <w:left w:val="single" w:sz="4" w:space="0" w:color="BFC7D1"/>
@@ -11685,7 +11683,7 @@
         </w:tc>
         <w:tc>
           <w:tcPr>
-            <w:tcW w:w="2257" w:type="dxa"/>
+            <w:tcW w:w="4485" w:type="dxa"/>
             <w:tcBorders>
               <w:top w:val="single" w:sz="4" w:space="0" w:color="BFC7D1"/>
               <w:left w:val="single" w:sz="4" w:space="0" w:color="BFC7D1"/>
@@ -11722,7 +11720,7 @@
         </w:tc>
         <w:tc>
           <w:tcPr>
-            <w:tcW w:w="2256" w:type="dxa"/>
+            <w:tcW w:w="1811" w:type="dxa"/>
             <w:tcBorders>
               <w:top w:val="single" w:sz="4" w:space="0" w:color="BFC7D1"/>
               <w:left w:val="single" w:sz="4" w:space="0" w:color="BFC7D1"/>
@@ -11762,7 +11760,7 @@
         <w:trPr/>
         <w:tc>
           <w:tcPr>
-            <w:tcW w:w="2257" w:type="dxa"/>
+            <w:tcW w:w="906" w:type="dxa"/>
             <w:tcBorders>
               <w:top w:val="single" w:sz="4" w:space="0" w:color="BFC7D1"/>
               <w:left w:val="single" w:sz="4" w:space="0" w:color="BFC7D1"/>
@@ -11799,7 +11797,7 @@
         </w:tc>
         <w:tc>
           <w:tcPr>
-            <w:tcW w:w="2257" w:type="dxa"/>
+            <w:tcW w:w="1811" w:type="dxa"/>
             <w:tcBorders>
               <w:top w:val="single" w:sz="4" w:space="0" w:color="BFC7D1"/>
               <w:left w:val="single" w:sz="4" w:space="0" w:color="BFC7D1"/>
@@ -11836,7 +11834,7 @@
         </w:tc>
         <w:tc>
           <w:tcPr>
-            <w:tcW w:w="2257" w:type="dxa"/>
+            <w:tcW w:w="4485" w:type="dxa"/>
             <w:tcBorders>
               <w:top w:val="single" w:sz="4" w:space="0" w:color="BFC7D1"/>
               <w:left w:val="single" w:sz="4" w:space="0" w:color="BFC7D1"/>
@@ -11873,7 +11871,7 @@
         </w:tc>
         <w:tc>
           <w:tcPr>
-            <w:tcW w:w="2256" w:type="dxa"/>
+            <w:tcW w:w="1811" w:type="dxa"/>
             <w:tcBorders>
               <w:top w:val="single" w:sz="4" w:space="0" w:color="BFC7D1"/>
               <w:left w:val="single" w:sz="4" w:space="0" w:color="BFC7D1"/>
@@ -11943,7 +11941,7 @@
         <w:pStyle w:val="Heading1"/>
         <w:rPr/>
       </w:pPr>
-      <w:bookmarkStart w:id="23" w:name="__RefHeading___Toc2469_2150771405"/>
+      <w:bookmarkStart w:id="23" w:name="__RefHeading___Toc5903_1649759004"/>
       <w:bookmarkEnd w:id="23"/>
       <w:r>
         <w:rPr>
@@ -11958,7 +11956,7 @@
     <w:tbl>
       <w:tblPr>
         <w:tblStyle w:val="TableGrid"/>
-        <w:tblW w:w="9026" w:type="dxa"/>
+        <w:tblW w:w="9014" w:type="dxa"/>
         <w:jc w:val="left"/>
         <w:tblInd w:w="0" w:type="dxa"/>
         <w:tblLayout w:type="fixed"/>
@@ -11971,8 +11969,8 @@
         <w:tblLook w:val="04a0" w:noHBand="0" w:noVBand="1" w:firstColumn="1" w:lastRow="0" w:lastColumn="0" w:firstRow="1"/>
       </w:tblPr>
       <w:tblGrid>
-        <w:gridCol w:w="4513"/>
-        <w:gridCol w:w="4512"/>
+        <w:gridCol w:w="4410"/>
+        <w:gridCol w:w="4603"/>
       </w:tblGrid>
       <w:tr>
         <w:trPr>
@@ -11980,7 +11978,7 @@
         </w:trPr>
         <w:tc>
           <w:tcPr>
-            <w:tcW w:w="4513" w:type="dxa"/>
+            <w:tcW w:w="4410" w:type="dxa"/>
             <w:tcBorders>
               <w:top w:val="single" w:sz="4" w:space="0" w:color="BFC7D1"/>
               <w:left w:val="single" w:sz="4" w:space="0" w:color="BFC7D1"/>
@@ -12019,7 +12017,7 @@
         </w:tc>
         <w:tc>
           <w:tcPr>
-            <w:tcW w:w="4512" w:type="dxa"/>
+            <w:tcW w:w="4603" w:type="dxa"/>
             <w:tcBorders>
               <w:top w:val="single" w:sz="4" w:space="0" w:color="BFC7D1"/>
               <w:left w:val="single" w:sz="4" w:space="0" w:color="BFC7D1"/>
@@ -12061,7 +12059,7 @@
         <w:trPr/>
         <w:tc>
           <w:tcPr>
-            <w:tcW w:w="4513" w:type="dxa"/>
+            <w:tcW w:w="4410" w:type="dxa"/>
             <w:tcBorders>
               <w:top w:val="single" w:sz="4" w:space="0" w:color="BFC7D1"/>
               <w:left w:val="single" w:sz="4" w:space="0" w:color="BFC7D1"/>
@@ -12098,7 +12096,7 @@
         </w:tc>
         <w:tc>
           <w:tcPr>
-            <w:tcW w:w="4512" w:type="dxa"/>
+            <w:tcW w:w="4603" w:type="dxa"/>
             <w:tcBorders>
               <w:top w:val="single" w:sz="4" w:space="0" w:color="BFC7D1"/>
               <w:left w:val="single" w:sz="4" w:space="0" w:color="BFC7D1"/>
@@ -12138,7 +12136,7 @@
         <w:trPr/>
         <w:tc>
           <w:tcPr>
-            <w:tcW w:w="4513" w:type="dxa"/>
+            <w:tcW w:w="4410" w:type="dxa"/>
             <w:tcBorders>
               <w:top w:val="single" w:sz="4" w:space="0" w:color="BFC7D1"/>
               <w:left w:val="single" w:sz="4" w:space="0" w:color="BFC7D1"/>
@@ -12175,7 +12173,7 @@
         </w:tc>
         <w:tc>
           <w:tcPr>
-            <w:tcW w:w="4512" w:type="dxa"/>
+            <w:tcW w:w="4603" w:type="dxa"/>
             <w:tcBorders>
               <w:top w:val="single" w:sz="4" w:space="0" w:color="BFC7D1"/>
               <w:left w:val="single" w:sz="4" w:space="0" w:color="BFC7D1"/>
@@ -12215,7 +12213,7 @@
         <w:trPr/>
         <w:tc>
           <w:tcPr>
-            <w:tcW w:w="4513" w:type="dxa"/>
+            <w:tcW w:w="4410" w:type="dxa"/>
             <w:tcBorders>
               <w:top w:val="single" w:sz="4" w:space="0" w:color="BFC7D1"/>
               <w:left w:val="single" w:sz="4" w:space="0" w:color="BFC7D1"/>
@@ -12252,7 +12250,7 @@
         </w:tc>
         <w:tc>
           <w:tcPr>
-            <w:tcW w:w="4512" w:type="dxa"/>
+            <w:tcW w:w="4603" w:type="dxa"/>
             <w:tcBorders>
               <w:top w:val="single" w:sz="4" w:space="0" w:color="BFC7D1"/>
               <w:left w:val="single" w:sz="4" w:space="0" w:color="BFC7D1"/>
@@ -12292,7 +12290,7 @@
         <w:trPr/>
         <w:tc>
           <w:tcPr>
-            <w:tcW w:w="4513" w:type="dxa"/>
+            <w:tcW w:w="4410" w:type="dxa"/>
             <w:tcBorders>
               <w:top w:val="single" w:sz="4" w:space="0" w:color="BFC7D1"/>
               <w:left w:val="single" w:sz="4" w:space="0" w:color="BFC7D1"/>
@@ -12329,7 +12327,7 @@
         </w:tc>
         <w:tc>
           <w:tcPr>
-            <w:tcW w:w="4512" w:type="dxa"/>
+            <w:tcW w:w="4603" w:type="dxa"/>
             <w:tcBorders>
               <w:top w:val="single" w:sz="4" w:space="0" w:color="BFC7D1"/>
               <w:left w:val="single" w:sz="4" w:space="0" w:color="BFC7D1"/>
@@ -12369,7 +12367,7 @@
         <w:trPr/>
         <w:tc>
           <w:tcPr>
-            <w:tcW w:w="4513" w:type="dxa"/>
+            <w:tcW w:w="4410" w:type="dxa"/>
             <w:tcBorders>
               <w:top w:val="single" w:sz="4" w:space="0" w:color="BFC7D1"/>
               <w:left w:val="single" w:sz="4" w:space="0" w:color="BFC7D1"/>
@@ -12406,7 +12404,7 @@
         </w:tc>
         <w:tc>
           <w:tcPr>
-            <w:tcW w:w="4512" w:type="dxa"/>
+            <w:tcW w:w="4603" w:type="dxa"/>
             <w:tcBorders>
               <w:top w:val="single" w:sz="4" w:space="0" w:color="BFC7D1"/>
               <w:left w:val="single" w:sz="4" w:space="0" w:color="BFC7D1"/>
@@ -12446,7 +12444,7 @@
         <w:trPr/>
         <w:tc>
           <w:tcPr>
-            <w:tcW w:w="4513" w:type="dxa"/>
+            <w:tcW w:w="4410" w:type="dxa"/>
             <w:tcBorders>
               <w:top w:val="single" w:sz="4" w:space="0" w:color="BFC7D1"/>
               <w:left w:val="single" w:sz="4" w:space="0" w:color="BFC7D1"/>
@@ -12483,7 +12481,7 @@
         </w:tc>
         <w:tc>
           <w:tcPr>
-            <w:tcW w:w="4512" w:type="dxa"/>
+            <w:tcW w:w="4603" w:type="dxa"/>
             <w:tcBorders>
               <w:top w:val="single" w:sz="4" w:space="0" w:color="BFC7D1"/>
               <w:left w:val="single" w:sz="4" w:space="0" w:color="BFC7D1"/>
@@ -12523,7 +12521,7 @@
         <w:trPr/>
         <w:tc>
           <w:tcPr>
-            <w:tcW w:w="4513" w:type="dxa"/>
+            <w:tcW w:w="4410" w:type="dxa"/>
             <w:tcBorders>
               <w:top w:val="single" w:sz="4" w:space="0" w:color="BFC7D1"/>
               <w:left w:val="single" w:sz="4" w:space="0" w:color="BFC7D1"/>
@@ -12560,7 +12558,7 @@
         </w:tc>
         <w:tc>
           <w:tcPr>
-            <w:tcW w:w="4512" w:type="dxa"/>
+            <w:tcW w:w="4603" w:type="dxa"/>
             <w:tcBorders>
               <w:top w:val="single" w:sz="4" w:space="0" w:color="BFC7D1"/>
               <w:left w:val="single" w:sz="4" w:space="0" w:color="BFC7D1"/>
@@ -12600,7 +12598,7 @@
         <w:trPr/>
         <w:tc>
           <w:tcPr>
-            <w:tcW w:w="4513" w:type="dxa"/>
+            <w:tcW w:w="4410" w:type="dxa"/>
             <w:tcBorders>
               <w:top w:val="single" w:sz="4" w:space="0" w:color="BFC7D1"/>
               <w:left w:val="single" w:sz="4" w:space="0" w:color="BFC7D1"/>
@@ -12637,7 +12635,7 @@
         </w:tc>
         <w:tc>
           <w:tcPr>
-            <w:tcW w:w="4512" w:type="dxa"/>
+            <w:tcW w:w="4603" w:type="dxa"/>
             <w:tcBorders>
               <w:top w:val="single" w:sz="4" w:space="0" w:color="BFC7D1"/>
               <w:left w:val="single" w:sz="4" w:space="0" w:color="BFC7D1"/>
@@ -12707,7 +12705,7 @@
         <w:pStyle w:val="Heading1"/>
         <w:rPr/>
       </w:pPr>
-      <w:bookmarkStart w:id="24" w:name="__RefHeading___Toc2471_2150771405"/>
+      <w:bookmarkStart w:id="24" w:name="__RefHeading___Toc5905_1649759004"/>
       <w:bookmarkEnd w:id="24"/>
       <w:r>
         <w:rPr>
@@ -12737,7 +12735,7 @@
     <w:tbl>
       <w:tblPr>
         <w:tblStyle w:val="TableGrid"/>
-        <w:tblW w:w="9028" w:type="dxa"/>
+        <w:tblW w:w="9014" w:type="dxa"/>
         <w:jc w:val="left"/>
         <w:tblInd w:w="0" w:type="dxa"/>
         <w:tblLayout w:type="fixed"/>
@@ -12750,10 +12748,10 @@
         <w:tblLook w:val="04a0" w:noHBand="0" w:noVBand="1" w:firstColumn="1" w:lastRow="0" w:lastColumn="0" w:firstRow="1"/>
       </w:tblPr>
       <w:tblGrid>
-        <w:gridCol w:w="2257"/>
-        <w:gridCol w:w="2257"/>
-        <w:gridCol w:w="2257"/>
-        <w:gridCol w:w="2256"/>
+        <w:gridCol w:w="3276"/>
+        <w:gridCol w:w="1423"/>
+        <w:gridCol w:w="1718"/>
+        <w:gridCol w:w="2596"/>
       </w:tblGrid>
       <w:tr>
         <w:trPr>
@@ -12761,7 +12759,7 @@
         </w:trPr>
         <w:tc>
           <w:tcPr>
-            <w:tcW w:w="2257" w:type="dxa"/>
+            <w:tcW w:w="3276" w:type="dxa"/>
             <w:tcBorders>
               <w:top w:val="single" w:sz="4" w:space="0" w:color="BFC7D1"/>
               <w:left w:val="single" w:sz="4" w:space="0" w:color="BFC7D1"/>
@@ -12800,7 +12798,7 @@
         </w:tc>
         <w:tc>
           <w:tcPr>
-            <w:tcW w:w="2257" w:type="dxa"/>
+            <w:tcW w:w="1423" w:type="dxa"/>
             <w:tcBorders>
               <w:top w:val="single" w:sz="4" w:space="0" w:color="BFC7D1"/>
               <w:left w:val="single" w:sz="4" w:space="0" w:color="BFC7D1"/>
@@ -12839,7 +12837,7 @@
         </w:tc>
         <w:tc>
           <w:tcPr>
-            <w:tcW w:w="2257" w:type="dxa"/>
+            <w:tcW w:w="1718" w:type="dxa"/>
             <w:tcBorders>
               <w:top w:val="single" w:sz="4" w:space="0" w:color="BFC7D1"/>
               <w:left w:val="single" w:sz="4" w:space="0" w:color="BFC7D1"/>
@@ -12878,7 +12876,7 @@
         </w:tc>
         <w:tc>
           <w:tcPr>
-            <w:tcW w:w="2256" w:type="dxa"/>
+            <w:tcW w:w="2596" w:type="dxa"/>
             <w:tcBorders>
               <w:top w:val="single" w:sz="4" w:space="0" w:color="BFC7D1"/>
               <w:left w:val="single" w:sz="4" w:space="0" w:color="BFC7D1"/>
@@ -12920,7 +12918,7 @@
         <w:trPr/>
         <w:tc>
           <w:tcPr>
-            <w:tcW w:w="2257" w:type="dxa"/>
+            <w:tcW w:w="3276" w:type="dxa"/>
             <w:tcBorders>
               <w:top w:val="single" w:sz="4" w:space="0" w:color="BFC7D1"/>
               <w:left w:val="single" w:sz="4" w:space="0" w:color="BFC7D1"/>
@@ -12957,7 +12955,7 @@
         </w:tc>
         <w:tc>
           <w:tcPr>
-            <w:tcW w:w="2257" w:type="dxa"/>
+            <w:tcW w:w="1423" w:type="dxa"/>
             <w:tcBorders>
               <w:top w:val="single" w:sz="4" w:space="0" w:color="BFC7D1"/>
               <w:left w:val="single" w:sz="4" w:space="0" w:color="BFC7D1"/>
@@ -12994,7 +12992,7 @@
         </w:tc>
         <w:tc>
           <w:tcPr>
-            <w:tcW w:w="2257" w:type="dxa"/>
+            <w:tcW w:w="1718" w:type="dxa"/>
             <w:tcBorders>
               <w:top w:val="single" w:sz="4" w:space="0" w:color="BFC7D1"/>
               <w:left w:val="single" w:sz="4" w:space="0" w:color="BFC7D1"/>
@@ -13031,7 +13029,7 @@
         </w:tc>
         <w:tc>
           <w:tcPr>
-            <w:tcW w:w="2256" w:type="dxa"/>
+            <w:tcW w:w="2596" w:type="dxa"/>
             <w:tcBorders>
               <w:top w:val="single" w:sz="4" w:space="0" w:color="BFC7D1"/>
               <w:left w:val="single" w:sz="4" w:space="0" w:color="BFC7D1"/>
@@ -13071,7 +13069,7 @@
         <w:trPr/>
         <w:tc>
           <w:tcPr>
-            <w:tcW w:w="2257" w:type="dxa"/>
+            <w:tcW w:w="3276" w:type="dxa"/>
             <w:tcBorders>
               <w:top w:val="single" w:sz="4" w:space="0" w:color="BFC7D1"/>
               <w:left w:val="single" w:sz="4" w:space="0" w:color="BFC7D1"/>
@@ -13108,7 +13106,7 @@
         </w:tc>
         <w:tc>
           <w:tcPr>
-            <w:tcW w:w="2257" w:type="dxa"/>
+            <w:tcW w:w="1423" w:type="dxa"/>
             <w:tcBorders>
               <w:top w:val="single" w:sz="4" w:space="0" w:color="BFC7D1"/>
               <w:left w:val="single" w:sz="4" w:space="0" w:color="BFC7D1"/>
@@ -13145,7 +13143,7 @@
         </w:tc>
         <w:tc>
           <w:tcPr>
-            <w:tcW w:w="2257" w:type="dxa"/>
+            <w:tcW w:w="1718" w:type="dxa"/>
             <w:tcBorders>
               <w:top w:val="single" w:sz="4" w:space="0" w:color="BFC7D1"/>
               <w:left w:val="single" w:sz="4" w:space="0" w:color="BFC7D1"/>
@@ -13182,7 +13180,7 @@
         </w:tc>
         <w:tc>
           <w:tcPr>
-            <w:tcW w:w="2256" w:type="dxa"/>
+            <w:tcW w:w="2596" w:type="dxa"/>
             <w:tcBorders>
               <w:top w:val="single" w:sz="4" w:space="0" w:color="BFC7D1"/>
               <w:left w:val="single" w:sz="4" w:space="0" w:color="BFC7D1"/>
@@ -13222,7 +13220,7 @@
         <w:trPr/>
         <w:tc>
           <w:tcPr>
-            <w:tcW w:w="2257" w:type="dxa"/>
+            <w:tcW w:w="3276" w:type="dxa"/>
             <w:tcBorders>
               <w:top w:val="single" w:sz="4" w:space="0" w:color="BFC7D1"/>
               <w:left w:val="single" w:sz="4" w:space="0" w:color="BFC7D1"/>
@@ -13259,7 +13257,7 @@
         </w:tc>
         <w:tc>
           <w:tcPr>
-            <w:tcW w:w="2257" w:type="dxa"/>
+            <w:tcW w:w="1423" w:type="dxa"/>
             <w:tcBorders>
               <w:top w:val="single" w:sz="4" w:space="0" w:color="BFC7D1"/>
               <w:left w:val="single" w:sz="4" w:space="0" w:color="BFC7D1"/>
@@ -13296,7 +13294,7 @@
         </w:tc>
         <w:tc>
           <w:tcPr>
-            <w:tcW w:w="2257" w:type="dxa"/>
+            <w:tcW w:w="1718" w:type="dxa"/>
             <w:tcBorders>
               <w:top w:val="single" w:sz="4" w:space="0" w:color="BFC7D1"/>
               <w:left w:val="single" w:sz="4" w:space="0" w:color="BFC7D1"/>
@@ -13333,7 +13331,7 @@
         </w:tc>
         <w:tc>
           <w:tcPr>
-            <w:tcW w:w="2256" w:type="dxa"/>
+            <w:tcW w:w="2596" w:type="dxa"/>
             <w:tcBorders>
               <w:top w:val="single" w:sz="4" w:space="0" w:color="BFC7D1"/>
               <w:left w:val="single" w:sz="4" w:space="0" w:color="BFC7D1"/>
@@ -13403,7 +13401,7 @@
         <w:pStyle w:val="Heading1"/>
         <w:rPr/>
       </w:pPr>
-      <w:bookmarkStart w:id="25" w:name="__RefHeading___Toc2473_2150771405"/>
+      <w:bookmarkStart w:id="25" w:name="__RefHeading___Toc5907_1649759004"/>
       <w:bookmarkEnd w:id="25"/>
       <w:r>
         <w:rPr>
@@ -13418,7 +13416,7 @@
     <w:tbl>
       <w:tblPr>
         <w:tblStyle w:val="TableGrid"/>
-        <w:tblW w:w="9026" w:type="dxa"/>
+        <w:tblW w:w="9015" w:type="dxa"/>
         <w:jc w:val="left"/>
         <w:tblInd w:w="0" w:type="dxa"/>
         <w:tblLayout w:type="fixed"/>
@@ -13431,8 +13429,8 @@
         <w:tblLook w:val="04a0" w:noHBand="0" w:noVBand="1" w:firstColumn="1" w:lastRow="0" w:lastColumn="0" w:firstRow="1"/>
       </w:tblPr>
       <w:tblGrid>
-        <w:gridCol w:w="4513"/>
-        <w:gridCol w:w="4512"/>
+        <w:gridCol w:w="3606"/>
+        <w:gridCol w:w="5408"/>
       </w:tblGrid>
       <w:tr>
         <w:trPr>
@@ -13440,7 +13438,7 @@
         </w:trPr>
         <w:tc>
           <w:tcPr>
-            <w:tcW w:w="4513" w:type="dxa"/>
+            <w:tcW w:w="3606" w:type="dxa"/>
             <w:tcBorders>
               <w:top w:val="single" w:sz="4" w:space="0" w:color="BFC7D1"/>
               <w:left w:val="single" w:sz="4" w:space="0" w:color="BFC7D1"/>
@@ -13479,7 +13477,7 @@
         </w:tc>
         <w:tc>
           <w:tcPr>
-            <w:tcW w:w="4512" w:type="dxa"/>
+            <w:tcW w:w="5408" w:type="dxa"/>
             <w:tcBorders>
               <w:top w:val="single" w:sz="4" w:space="0" w:color="BFC7D1"/>
               <w:left w:val="single" w:sz="4" w:space="0" w:color="BFC7D1"/>
@@ -13521,7 +13519,7 @@
         <w:trPr/>
         <w:tc>
           <w:tcPr>
-            <w:tcW w:w="4513" w:type="dxa"/>
+            <w:tcW w:w="3606" w:type="dxa"/>
             <w:tcBorders>
               <w:top w:val="single" w:sz="4" w:space="0" w:color="BFC7D1"/>
               <w:left w:val="single" w:sz="4" w:space="0" w:color="BFC7D1"/>
@@ -13558,7 +13556,7 @@
         </w:tc>
         <w:tc>
           <w:tcPr>
-            <w:tcW w:w="4512" w:type="dxa"/>
+            <w:tcW w:w="5408" w:type="dxa"/>
             <w:tcBorders>
               <w:top w:val="single" w:sz="4" w:space="0" w:color="BFC7D1"/>
               <w:left w:val="single" w:sz="4" w:space="0" w:color="BFC7D1"/>
@@ -13598,7 +13596,7 @@
         <w:trPr/>
         <w:tc>
           <w:tcPr>
-            <w:tcW w:w="4513" w:type="dxa"/>
+            <w:tcW w:w="3606" w:type="dxa"/>
             <w:tcBorders>
               <w:top w:val="single" w:sz="4" w:space="0" w:color="BFC7D1"/>
               <w:left w:val="single" w:sz="4" w:space="0" w:color="BFC7D1"/>
@@ -13635,7 +13633,7 @@
         </w:tc>
         <w:tc>
           <w:tcPr>
-            <w:tcW w:w="4512" w:type="dxa"/>
+            <w:tcW w:w="5408" w:type="dxa"/>
             <w:tcBorders>
               <w:top w:val="single" w:sz="4" w:space="0" w:color="BFC7D1"/>
               <w:left w:val="single" w:sz="4" w:space="0" w:color="BFC7D1"/>
@@ -13675,7 +13673,7 @@
         <w:trPr/>
         <w:tc>
           <w:tcPr>
-            <w:tcW w:w="4513" w:type="dxa"/>
+            <w:tcW w:w="3606" w:type="dxa"/>
             <w:tcBorders>
               <w:top w:val="single" w:sz="4" w:space="0" w:color="BFC7D1"/>
               <w:left w:val="single" w:sz="4" w:space="0" w:color="BFC7D1"/>
@@ -13712,7 +13710,7 @@
         </w:tc>
         <w:tc>
           <w:tcPr>
-            <w:tcW w:w="4512" w:type="dxa"/>
+            <w:tcW w:w="5408" w:type="dxa"/>
             <w:tcBorders>
               <w:top w:val="single" w:sz="4" w:space="0" w:color="BFC7D1"/>
               <w:left w:val="single" w:sz="4" w:space="0" w:color="BFC7D1"/>
@@ -13752,7 +13750,7 @@
         <w:trPr/>
         <w:tc>
           <w:tcPr>
-            <w:tcW w:w="4513" w:type="dxa"/>
+            <w:tcW w:w="3606" w:type="dxa"/>
             <w:tcBorders>
               <w:top w:val="single" w:sz="4" w:space="0" w:color="BFC7D1"/>
               <w:left w:val="single" w:sz="4" w:space="0" w:color="BFC7D1"/>
@@ -13789,7 +13787,7 @@
         </w:tc>
         <w:tc>
           <w:tcPr>
-            <w:tcW w:w="4512" w:type="dxa"/>
+            <w:tcW w:w="5408" w:type="dxa"/>
             <w:tcBorders>
               <w:top w:val="single" w:sz="4" w:space="0" w:color="BFC7D1"/>
               <w:left w:val="single" w:sz="4" w:space="0" w:color="BFC7D1"/>
@@ -13829,7 +13827,7 @@
         <w:trPr/>
         <w:tc>
           <w:tcPr>
-            <w:tcW w:w="4513" w:type="dxa"/>
+            <w:tcW w:w="3606" w:type="dxa"/>
             <w:tcBorders>
               <w:top w:val="single" w:sz="4" w:space="0" w:color="BFC7D1"/>
               <w:left w:val="single" w:sz="4" w:space="0" w:color="BFC7D1"/>
@@ -13866,7 +13864,7 @@
         </w:tc>
         <w:tc>
           <w:tcPr>
-            <w:tcW w:w="4512" w:type="dxa"/>
+            <w:tcW w:w="5408" w:type="dxa"/>
             <w:tcBorders>
               <w:top w:val="single" w:sz="4" w:space="0" w:color="BFC7D1"/>
               <w:left w:val="single" w:sz="4" w:space="0" w:color="BFC7D1"/>
@@ -13906,7 +13904,7 @@
         <w:trPr/>
         <w:tc>
           <w:tcPr>
-            <w:tcW w:w="4513" w:type="dxa"/>
+            <w:tcW w:w="3606" w:type="dxa"/>
             <w:tcBorders>
               <w:top w:val="single" w:sz="4" w:space="0" w:color="BFC7D1"/>
               <w:left w:val="single" w:sz="4" w:space="0" w:color="BFC7D1"/>
@@ -13943,7 +13941,7 @@
         </w:tc>
         <w:tc>
           <w:tcPr>
-            <w:tcW w:w="4512" w:type="dxa"/>
+            <w:tcW w:w="5408" w:type="dxa"/>
             <w:tcBorders>
               <w:top w:val="single" w:sz="4" w:space="0" w:color="BFC7D1"/>
               <w:left w:val="single" w:sz="4" w:space="0" w:color="BFC7D1"/>
@@ -13983,7 +13981,7 @@
         <w:trPr/>
         <w:tc>
           <w:tcPr>
-            <w:tcW w:w="4513" w:type="dxa"/>
+            <w:tcW w:w="3606" w:type="dxa"/>
             <w:tcBorders>
               <w:top w:val="single" w:sz="4" w:space="0" w:color="BFC7D1"/>
               <w:left w:val="single" w:sz="4" w:space="0" w:color="BFC7D1"/>
@@ -14020,7 +14018,7 @@
         </w:tc>
         <w:tc>
           <w:tcPr>
-            <w:tcW w:w="4512" w:type="dxa"/>
+            <w:tcW w:w="5408" w:type="dxa"/>
             <w:tcBorders>
               <w:top w:val="single" w:sz="4" w:space="0" w:color="BFC7D1"/>
               <w:left w:val="single" w:sz="4" w:space="0" w:color="BFC7D1"/>
@@ -14090,7 +14088,7 @@
         <w:pStyle w:val="Heading1"/>
         <w:rPr/>
       </w:pPr>
-      <w:bookmarkStart w:id="26" w:name="__RefHeading___Toc2475_2150771405"/>
+      <w:bookmarkStart w:id="26" w:name="__RefHeading___Toc5909_1649759004"/>
       <w:bookmarkEnd w:id="26"/>
       <w:r>
         <w:rPr>
@@ -14167,7 +14165,7 @@
         <w:pStyle w:val="Heading1"/>
         <w:rPr/>
       </w:pPr>
-      <w:bookmarkStart w:id="27" w:name="__RefHeading___Toc2477_2150771405"/>
+      <w:bookmarkStart w:id="27" w:name="__RefHeading___Toc5911_1649759004"/>
       <w:bookmarkEnd w:id="27"/>
       <w:r>
         <w:rPr>
@@ -14301,7 +14299,7 @@
         <w:pStyle w:val="Heading1"/>
         <w:rPr/>
       </w:pPr>
-      <w:bookmarkStart w:id="28" w:name="__RefHeading___Toc2479_2150771405"/>
+      <w:bookmarkStart w:id="28" w:name="__RefHeading___Toc5913_1649759004"/>
       <w:bookmarkEnd w:id="28"/>
       <w:r>
         <w:rPr>
@@ -14411,7 +14409,7 @@
           <w:spacing w:val="0"/>
         </w:rPr>
       </w:pPr>
-      <w:bookmarkStart w:id="29" w:name="__RefHeading___Toc2481_2150771405"/>
+      <w:bookmarkStart w:id="29" w:name="__RefHeading___Toc5915_1649759004"/>
       <w:bookmarkStart w:id="30" w:name="_Toc233203395"/>
       <w:bookmarkEnd w:id="29"/>
       <w:r>
@@ -16183,7 +16181,7 @@
       <w:r>
         <w:rPr/>
         <w:drawing>
-          <wp:anchor behindDoc="1" distT="0" distB="0" distL="0" distR="0" simplePos="0" locked="0" layoutInCell="0" allowOverlap="1" relativeHeight="23">
+          <wp:anchor behindDoc="1" distT="0" distB="0" distL="0" distR="0" simplePos="0" locked="0" layoutInCell="0" allowOverlap="1" relativeHeight="22">
             <wp:simplePos x="0" y="0"/>
             <wp:positionH relativeFrom="margin">
               <wp:align>center</wp:align>
@@ -16254,7 +16252,7 @@
     <w:r>
       <w:rPr/>
       <w:drawing>
-        <wp:anchor behindDoc="1" distT="0" distB="0" distL="0" distR="0" simplePos="0" locked="0" layoutInCell="0" allowOverlap="1" relativeHeight="22">
+        <wp:anchor behindDoc="1" distT="0" distB="0" distL="0" distR="0" simplePos="0" locked="0" layoutInCell="0" allowOverlap="1" relativeHeight="21">
           <wp:simplePos x="0" y="0"/>
           <wp:positionH relativeFrom="page">
             <wp:align>left</wp:align>
@@ -16313,7 +16311,7 @@
     <w:r>
       <w:rPr/>
       <w:drawing>
-        <wp:anchor behindDoc="1" distT="0" distB="0" distL="0" distR="0" simplePos="0" locked="0" layoutInCell="0" allowOverlap="1" relativeHeight="22">
+        <wp:anchor behindDoc="1" distT="0" distB="0" distL="0" distR="0" simplePos="0" locked="0" layoutInCell="0" allowOverlap="1" relativeHeight="21">
           <wp:simplePos x="0" y="0"/>
           <wp:positionH relativeFrom="page">
             <wp:align>left</wp:align>

</xml_diff>